<commit_message>
justify backend stack selection
</commit_message>
<xml_diff>
--- a/docs/reports/Отчёт_по_учебной_практике_ThermoSelect.docx
+++ b/docs/reports/Отчёт_по_учебной_практике_ThermoSelect.docx
@@ -12,7 +12,7 @@
           <w:noProof/>
         </w:rPr>
         <w:drawing>
-          <wp:inline distT="0" distB="0" distL="0" distR="0" wp14:anchorId="52D2BCFE" wp14:editId="79A92E9E">
+          <wp:inline distT="0" distB="0" distL="0" distR="0" wp14:anchorId="6A9EF360" wp14:editId="6EEB977E">
             <wp:extent cx="621792" cy="799447"/>
             <wp:effectExtent l="0" t="0" r="0" b="0"/>
             <wp:docPr id="1" name="Picture 1" descr="Эмблема СПбГТИ(ТУ)"/>
@@ -1408,7 +1408,7 @@
       <w:pPr>
         <w:pStyle w:val="1"/>
       </w:pPr>
-      <w:bookmarkStart w:id="0" w:name="_Toc234800616"/>
+      <w:bookmarkStart w:id="0" w:name="_Toc234829209"/>
       <w:r>
         <w:rPr>
           <w:rFonts w:ascii="Times New Roman" w:eastAsia="Times New Roman" w:hAnsi="Times New Roman" w:cs="Times New Roman"/>
@@ -1473,7 +1473,7 @@
         <w:pStyle w:val="1"/>
         <w:pageBreakBefore/>
       </w:pPr>
-      <w:bookmarkStart w:id="1" w:name="_Toc234800617"/>
+      <w:bookmarkStart w:id="1" w:name="_Toc234829210"/>
       <w:r>
         <w:rPr>
           <w:rFonts w:ascii="Times New Roman" w:eastAsia="Times New Roman" w:hAnsi="Times New Roman" w:cs="Times New Roman"/>
@@ -1517,7 +1517,7 @@
         </w:rPr>
         <w:fldChar w:fldCharType="separate"/>
       </w:r>
-      <w:hyperlink w:anchor="_Toc234800616" w:history="1">
+      <w:hyperlink w:anchor="_Toc234829209" w:history="1">
         <w:r>
           <w:rPr>
             <w:rStyle w:val="aff8"/>
@@ -1545,7 +1545,7 @@
             <w:noProof/>
             <w:webHidden/>
           </w:rPr>
-          <w:instrText xml:space="preserve"> PAGEREF _Toc234800616 \h </w:instrText>
+          <w:instrText xml:space="preserve"> PAGEREF _Toc234829209 \h </w:instrText>
         </w:r>
         <w:r>
           <w:rPr>
@@ -1592,7 +1592,7 @@
           <w14:ligatures w14:val="standardContextual"/>
         </w:rPr>
       </w:pPr>
-      <w:hyperlink w:anchor="_Toc234800617" w:history="1">
+      <w:hyperlink w:anchor="_Toc234829210" w:history="1">
         <w:r>
           <w:rPr>
             <w:rStyle w:val="aff8"/>
@@ -1620,7 +1620,7 @@
             <w:noProof/>
             <w:webHidden/>
           </w:rPr>
-          <w:instrText xml:space="preserve"> PAGEREF _Toc234800617 \h </w:instrText>
+          <w:instrText xml:space="preserve"> PAGEREF _Toc234829210 \h </w:instrText>
         </w:r>
         <w:r>
           <w:rPr>
@@ -1667,7 +1667,7 @@
           <w14:ligatures w14:val="standardContextual"/>
         </w:rPr>
       </w:pPr>
-      <w:hyperlink w:anchor="_Toc234800618" w:history="1">
+      <w:hyperlink w:anchor="_Toc234829211" w:history="1">
         <w:r>
           <w:rPr>
             <w:rStyle w:val="aff8"/>
@@ -1695,7 +1695,7 @@
             <w:noProof/>
             <w:webHidden/>
           </w:rPr>
-          <w:instrText xml:space="preserve"> PAGEREF _Toc234800618 \h </w:instrText>
+          <w:instrText xml:space="preserve"> PAGEREF _Toc234829211 \h </w:instrText>
         </w:r>
         <w:r>
           <w:rPr>
@@ -1742,7 +1742,7 @@
           <w14:ligatures w14:val="standardContextual"/>
         </w:rPr>
       </w:pPr>
-      <w:hyperlink w:anchor="_Toc234800619" w:history="1">
+      <w:hyperlink w:anchor="_Toc234829212" w:history="1">
         <w:r>
           <w:rPr>
             <w:rStyle w:val="aff8"/>
@@ -1770,7 +1770,7 @@
             <w:noProof/>
             <w:webHidden/>
           </w:rPr>
-          <w:instrText xml:space="preserve"> PAGEREF _Toc234800619 \h </w:instrText>
+          <w:instrText xml:space="preserve"> PAGEREF _Toc234829212 \h </w:instrText>
         </w:r>
         <w:r>
           <w:rPr>
@@ -1817,7 +1817,7 @@
           <w14:ligatures w14:val="standardContextual"/>
         </w:rPr>
       </w:pPr>
-      <w:hyperlink w:anchor="_Toc234800620" w:history="1">
+      <w:hyperlink w:anchor="_Toc234829213" w:history="1">
         <w:r>
           <w:rPr>
             <w:rStyle w:val="aff8"/>
@@ -1845,7 +1845,7 @@
             <w:noProof/>
             <w:webHidden/>
           </w:rPr>
-          <w:instrText xml:space="preserve"> PAGEREF _Toc234800620 \h </w:instrText>
+          <w:instrText xml:space="preserve"> PAGEREF _Toc234829213 \h </w:instrText>
         </w:r>
         <w:r>
           <w:rPr>
@@ -1892,7 +1892,7 @@
           <w14:ligatures w14:val="standardContextual"/>
         </w:rPr>
       </w:pPr>
-      <w:hyperlink w:anchor="_Toc234800621" w:history="1">
+      <w:hyperlink w:anchor="_Toc234829214" w:history="1">
         <w:r>
           <w:rPr>
             <w:rStyle w:val="aff8"/>
@@ -1920,7 +1920,7 @@
             <w:noProof/>
             <w:webHidden/>
           </w:rPr>
-          <w:instrText xml:space="preserve"> PAGEREF _Toc234800621 \h </w:instrText>
+          <w:instrText xml:space="preserve"> PAGEREF _Toc234829214 \h </w:instrText>
         </w:r>
         <w:r>
           <w:rPr>
@@ -1967,7 +1967,7 @@
           <w14:ligatures w14:val="standardContextual"/>
         </w:rPr>
       </w:pPr>
-      <w:hyperlink w:anchor="_Toc234800622" w:history="1">
+      <w:hyperlink w:anchor="_Toc234829215" w:history="1">
         <w:r>
           <w:rPr>
             <w:rStyle w:val="aff8"/>
@@ -1995,7 +1995,7 @@
             <w:noProof/>
             <w:webHidden/>
           </w:rPr>
-          <w:instrText xml:space="preserve"> PAGEREF _Toc234800622 \h </w:instrText>
+          <w:instrText xml:space="preserve"> PAGEREF _Toc234829215 \h </w:instrText>
         </w:r>
         <w:r>
           <w:rPr>
@@ -2042,7 +2042,7 @@
           <w14:ligatures w14:val="standardContextual"/>
         </w:rPr>
       </w:pPr>
-      <w:hyperlink w:anchor="_Toc234800623" w:history="1">
+      <w:hyperlink w:anchor="_Toc234829216" w:history="1">
         <w:r>
           <w:rPr>
             <w:rStyle w:val="aff8"/>
@@ -2070,7 +2070,7 @@
             <w:noProof/>
             <w:webHidden/>
           </w:rPr>
-          <w:instrText xml:space="preserve"> PAGEREF _Toc234800623 \h </w:instrText>
+          <w:instrText xml:space="preserve"> PAGEREF _Toc234829216 \h </w:instrText>
         </w:r>
         <w:r>
           <w:rPr>
@@ -2117,7 +2117,7 @@
           <w14:ligatures w14:val="standardContextual"/>
         </w:rPr>
       </w:pPr>
-      <w:hyperlink w:anchor="_Toc234800624" w:history="1">
+      <w:hyperlink w:anchor="_Toc234829217" w:history="1">
         <w:r>
           <w:rPr>
             <w:rStyle w:val="aff8"/>
@@ -2145,7 +2145,7 @@
             <w:noProof/>
             <w:webHidden/>
           </w:rPr>
-          <w:instrText xml:space="preserve"> PAGEREF _Toc234800624 \h </w:instrText>
+          <w:instrText xml:space="preserve"> PAGEREF _Toc234829217 \h </w:instrText>
         </w:r>
         <w:r>
           <w:rPr>
@@ -2192,7 +2192,7 @@
           <w14:ligatures w14:val="standardContextual"/>
         </w:rPr>
       </w:pPr>
-      <w:hyperlink w:anchor="_Toc234800625" w:history="1">
+      <w:hyperlink w:anchor="_Toc234829218" w:history="1">
         <w:r>
           <w:rPr>
             <w:rStyle w:val="aff8"/>
@@ -2220,7 +2220,7 @@
             <w:noProof/>
             <w:webHidden/>
           </w:rPr>
-          <w:instrText xml:space="preserve"> PAGEREF _Toc234800625 \h </w:instrText>
+          <w:instrText xml:space="preserve"> PAGEREF _Toc234829218 \h </w:instrText>
         </w:r>
         <w:r>
           <w:rPr>
@@ -2267,7 +2267,7 @@
           <w14:ligatures w14:val="standardContextual"/>
         </w:rPr>
       </w:pPr>
-      <w:hyperlink w:anchor="_Toc234800626" w:history="1">
+      <w:hyperlink w:anchor="_Toc234829219" w:history="1">
         <w:r>
           <w:rPr>
             <w:rStyle w:val="aff8"/>
@@ -2295,7 +2295,7 @@
             <w:noProof/>
             <w:webHidden/>
           </w:rPr>
-          <w:instrText xml:space="preserve"> PAGEREF _Toc234800626 \h </w:instrText>
+          <w:instrText xml:space="preserve"> PAGEREF _Toc234829219 \h </w:instrText>
         </w:r>
         <w:r>
           <w:rPr>
@@ -2342,7 +2342,7 @@
           <w14:ligatures w14:val="standardContextual"/>
         </w:rPr>
       </w:pPr>
-      <w:hyperlink w:anchor="_Toc234800627" w:history="1">
+      <w:hyperlink w:anchor="_Toc234829220" w:history="1">
         <w:r>
           <w:rPr>
             <w:rStyle w:val="aff8"/>
@@ -2370,7 +2370,7 @@
             <w:noProof/>
             <w:webHidden/>
           </w:rPr>
-          <w:instrText xml:space="preserve"> PAGEREF _Toc234800627 \h </w:instrText>
+          <w:instrText xml:space="preserve"> PAGEREF _Toc234829220 \h </w:instrText>
         </w:r>
         <w:r>
           <w:rPr>
@@ -2417,7 +2417,7 @@
           <w14:ligatures w14:val="standardContextual"/>
         </w:rPr>
       </w:pPr>
-      <w:hyperlink w:anchor="_Toc234800628" w:history="1">
+      <w:hyperlink w:anchor="_Toc234829221" w:history="1">
         <w:r>
           <w:rPr>
             <w:rStyle w:val="aff8"/>
@@ -2445,7 +2445,7 @@
             <w:noProof/>
             <w:webHidden/>
           </w:rPr>
-          <w:instrText xml:space="preserve"> PAGEREF _Toc234800628 \h </w:instrText>
+          <w:instrText xml:space="preserve"> PAGEREF _Toc234829221 \h </w:instrText>
         </w:r>
         <w:r>
           <w:rPr>
@@ -2492,7 +2492,7 @@
           <w14:ligatures w14:val="standardContextual"/>
         </w:rPr>
       </w:pPr>
-      <w:hyperlink w:anchor="_Toc234800629" w:history="1">
+      <w:hyperlink w:anchor="_Toc234829222" w:history="1">
         <w:r>
           <w:rPr>
             <w:rStyle w:val="aff8"/>
@@ -2520,7 +2520,7 @@
             <w:noProof/>
             <w:webHidden/>
           </w:rPr>
-          <w:instrText xml:space="preserve"> PAGEREF _Toc234800629 \h </w:instrText>
+          <w:instrText xml:space="preserve"> PAGEREF _Toc234829222 \h </w:instrText>
         </w:r>
         <w:r>
           <w:rPr>
@@ -2567,7 +2567,7 @@
           <w14:ligatures w14:val="standardContextual"/>
         </w:rPr>
       </w:pPr>
-      <w:hyperlink w:anchor="_Toc234800630" w:history="1">
+      <w:hyperlink w:anchor="_Toc234829223" w:history="1">
         <w:r>
           <w:rPr>
             <w:rStyle w:val="aff8"/>
@@ -2595,7 +2595,7 @@
             <w:noProof/>
             <w:webHidden/>
           </w:rPr>
-          <w:instrText xml:space="preserve"> PAGEREF _Toc234800630 \h </w:instrText>
+          <w:instrText xml:space="preserve"> PAGEREF _Toc234829223 \h </w:instrText>
         </w:r>
         <w:r>
           <w:rPr>
@@ -2642,7 +2642,7 @@
           <w14:ligatures w14:val="standardContextual"/>
         </w:rPr>
       </w:pPr>
-      <w:hyperlink w:anchor="_Toc234800631" w:history="1">
+      <w:hyperlink w:anchor="_Toc234829224" w:history="1">
         <w:r>
           <w:rPr>
             <w:rStyle w:val="aff8"/>
@@ -2670,7 +2670,7 @@
             <w:noProof/>
             <w:webHidden/>
           </w:rPr>
-          <w:instrText xml:space="preserve"> PAGEREF _Toc234800631 \h </w:instrText>
+          <w:instrText xml:space="preserve"> PAGEREF _Toc234829224 \h </w:instrText>
         </w:r>
         <w:r>
           <w:rPr>
@@ -2717,7 +2717,7 @@
           <w14:ligatures w14:val="standardContextual"/>
         </w:rPr>
       </w:pPr>
-      <w:hyperlink w:anchor="_Toc234800632" w:history="1">
+      <w:hyperlink w:anchor="_Toc234829225" w:history="1">
         <w:r>
           <w:rPr>
             <w:rStyle w:val="aff8"/>
@@ -2745,7 +2745,7 @@
             <w:noProof/>
             <w:webHidden/>
           </w:rPr>
-          <w:instrText xml:space="preserve"> PAGEREF _Toc234800632 \h </w:instrText>
+          <w:instrText xml:space="preserve"> PAGEREF _Toc234829225 \h </w:instrText>
         </w:r>
         <w:r>
           <w:rPr>
@@ -2765,7 +2765,7 @@
             <w:noProof/>
             <w:webHidden/>
           </w:rPr>
-          <w:t>16</w:t>
+          <w:t>17</w:t>
         </w:r>
         <w:r>
           <w:rPr>
@@ -2792,7 +2792,7 @@
           <w14:ligatures w14:val="standardContextual"/>
         </w:rPr>
       </w:pPr>
-      <w:hyperlink w:anchor="_Toc234800633" w:history="1">
+      <w:hyperlink w:anchor="_Toc234829226" w:history="1">
         <w:r>
           <w:rPr>
             <w:rStyle w:val="aff8"/>
@@ -2820,7 +2820,7 @@
             <w:noProof/>
             <w:webHidden/>
           </w:rPr>
-          <w:instrText xml:space="preserve"> PAGEREF _Toc234800633 \h </w:instrText>
+          <w:instrText xml:space="preserve"> PAGEREF _Toc234829226 \h </w:instrText>
         </w:r>
         <w:r>
           <w:rPr>
@@ -2840,7 +2840,7 @@
             <w:noProof/>
             <w:webHidden/>
           </w:rPr>
-          <w:t>17</w:t>
+          <w:t>18</w:t>
         </w:r>
         <w:r>
           <w:rPr>
@@ -2867,7 +2867,7 @@
           <w14:ligatures w14:val="standardContextual"/>
         </w:rPr>
       </w:pPr>
-      <w:hyperlink w:anchor="_Toc234800634" w:history="1">
+      <w:hyperlink w:anchor="_Toc234829227" w:history="1">
         <w:r>
           <w:rPr>
             <w:rStyle w:val="aff8"/>
@@ -2895,7 +2895,7 @@
             <w:noProof/>
             <w:webHidden/>
           </w:rPr>
-          <w:instrText xml:space="preserve"> PAGEREF _Toc234800634 \h </w:instrText>
+          <w:instrText xml:space="preserve"> PAGEREF _Toc234829227 \h </w:instrText>
         </w:r>
         <w:r>
           <w:rPr>
@@ -2915,7 +2915,7 @@
             <w:noProof/>
             <w:webHidden/>
           </w:rPr>
-          <w:t>17</w:t>
+          <w:t>18</w:t>
         </w:r>
         <w:r>
           <w:rPr>
@@ -2942,7 +2942,7 @@
           <w14:ligatures w14:val="standardContextual"/>
         </w:rPr>
       </w:pPr>
-      <w:hyperlink w:anchor="_Toc234800635" w:history="1">
+      <w:hyperlink w:anchor="_Toc234829228" w:history="1">
         <w:r>
           <w:rPr>
             <w:rStyle w:val="aff8"/>
@@ -2970,7 +2970,7 @@
             <w:noProof/>
             <w:webHidden/>
           </w:rPr>
-          <w:instrText xml:space="preserve"> PAGEREF _Toc234800635 \h </w:instrText>
+          <w:instrText xml:space="preserve"> PAGEREF _Toc234829228 \h </w:instrText>
         </w:r>
         <w:r>
           <w:rPr>
@@ -2990,7 +2990,7 @@
             <w:noProof/>
             <w:webHidden/>
           </w:rPr>
-          <w:t>17</w:t>
+          <w:t>18</w:t>
         </w:r>
         <w:r>
           <w:rPr>
@@ -3017,7 +3017,7 @@
           <w14:ligatures w14:val="standardContextual"/>
         </w:rPr>
       </w:pPr>
-      <w:hyperlink w:anchor="_Toc234800636" w:history="1">
+      <w:hyperlink w:anchor="_Toc234829229" w:history="1">
         <w:r>
           <w:rPr>
             <w:rStyle w:val="aff8"/>
@@ -3045,7 +3045,7 @@
             <w:noProof/>
             <w:webHidden/>
           </w:rPr>
-          <w:instrText xml:space="preserve"> PAGEREF _Toc234800636 \h </w:instrText>
+          <w:instrText xml:space="preserve"> PAGEREF _Toc234829229 \h </w:instrText>
         </w:r>
         <w:r>
           <w:rPr>
@@ -3065,7 +3065,7 @@
             <w:noProof/>
             <w:webHidden/>
           </w:rPr>
-          <w:t>18</w:t>
+          <w:t>19</w:t>
         </w:r>
         <w:r>
           <w:rPr>
@@ -3092,7 +3092,7 @@
           <w14:ligatures w14:val="standardContextual"/>
         </w:rPr>
       </w:pPr>
-      <w:hyperlink w:anchor="_Toc234800637" w:history="1">
+      <w:hyperlink w:anchor="_Toc234829230" w:history="1">
         <w:r>
           <w:rPr>
             <w:rStyle w:val="aff8"/>
@@ -3120,7 +3120,7 @@
             <w:noProof/>
             <w:webHidden/>
           </w:rPr>
-          <w:instrText xml:space="preserve"> PAGEREF _Toc234800637 \h </w:instrText>
+          <w:instrText xml:space="preserve"> PAGEREF _Toc234829230 \h </w:instrText>
         </w:r>
         <w:r>
           <w:rPr>
@@ -3140,7 +3140,7 @@
             <w:noProof/>
             <w:webHidden/>
           </w:rPr>
-          <w:t>19</w:t>
+          <w:t>20</w:t>
         </w:r>
         <w:r>
           <w:rPr>
@@ -3167,7 +3167,7 @@
           <w14:ligatures w14:val="standardContextual"/>
         </w:rPr>
       </w:pPr>
-      <w:hyperlink w:anchor="_Toc234800638" w:history="1">
+      <w:hyperlink w:anchor="_Toc234829231" w:history="1">
         <w:r>
           <w:rPr>
             <w:rStyle w:val="aff8"/>
@@ -3195,7 +3195,7 @@
             <w:noProof/>
             <w:webHidden/>
           </w:rPr>
-          <w:instrText xml:space="preserve"> PAGEREF _Toc234800638 \h </w:instrText>
+          <w:instrText xml:space="preserve"> PAGEREF _Toc234829231 \h </w:instrText>
         </w:r>
         <w:r>
           <w:rPr>
@@ -3215,7 +3215,7 @@
             <w:noProof/>
             <w:webHidden/>
           </w:rPr>
-          <w:t>19</w:t>
+          <w:t>20</w:t>
         </w:r>
         <w:r>
           <w:rPr>
@@ -3242,7 +3242,7 @@
           <w14:ligatures w14:val="standardContextual"/>
         </w:rPr>
       </w:pPr>
-      <w:hyperlink w:anchor="_Toc234800639" w:history="1">
+      <w:hyperlink w:anchor="_Toc234829232" w:history="1">
         <w:r>
           <w:rPr>
             <w:rStyle w:val="aff8"/>
@@ -3270,7 +3270,7 @@
             <w:noProof/>
             <w:webHidden/>
           </w:rPr>
-          <w:instrText xml:space="preserve"> PAGEREF _Toc234800639 \h </w:instrText>
+          <w:instrText xml:space="preserve"> PAGEREF _Toc234829232 \h </w:instrText>
         </w:r>
         <w:r>
           <w:rPr>
@@ -3290,7 +3290,7 @@
             <w:noProof/>
             <w:webHidden/>
           </w:rPr>
-          <w:t>19</w:t>
+          <w:t>20</w:t>
         </w:r>
         <w:r>
           <w:rPr>
@@ -3317,7 +3317,7 @@
           <w14:ligatures w14:val="standardContextual"/>
         </w:rPr>
       </w:pPr>
-      <w:hyperlink w:anchor="_Toc234800640" w:history="1">
+      <w:hyperlink w:anchor="_Toc234829233" w:history="1">
         <w:r>
           <w:rPr>
             <w:rStyle w:val="aff8"/>
@@ -3345,7 +3345,7 @@
             <w:noProof/>
             <w:webHidden/>
           </w:rPr>
-          <w:instrText xml:space="preserve"> PAGEREF _Toc234800640 \h </w:instrText>
+          <w:instrText xml:space="preserve"> PAGEREF _Toc234829233 \h </w:instrText>
         </w:r>
         <w:r>
           <w:rPr>
@@ -3365,7 +3365,7 @@
             <w:noProof/>
             <w:webHidden/>
           </w:rPr>
-          <w:t>19</w:t>
+          <w:t>20</w:t>
         </w:r>
         <w:r>
           <w:rPr>
@@ -3392,7 +3392,7 @@
           <w14:ligatures w14:val="standardContextual"/>
         </w:rPr>
       </w:pPr>
-      <w:hyperlink w:anchor="_Toc234800641" w:history="1">
+      <w:hyperlink w:anchor="_Toc234829234" w:history="1">
         <w:r>
           <w:rPr>
             <w:rStyle w:val="aff8"/>
@@ -3420,7 +3420,7 @@
             <w:noProof/>
             <w:webHidden/>
           </w:rPr>
-          <w:instrText xml:space="preserve"> PAGEREF _Toc234800641 \h </w:instrText>
+          <w:instrText xml:space="preserve"> PAGEREF _Toc234829234 \h </w:instrText>
         </w:r>
         <w:r>
           <w:rPr>
@@ -3440,7 +3440,7 @@
             <w:noProof/>
             <w:webHidden/>
           </w:rPr>
-          <w:t>20</w:t>
+          <w:t>21</w:t>
         </w:r>
         <w:r>
           <w:rPr>
@@ -3467,7 +3467,7 @@
           <w14:ligatures w14:val="standardContextual"/>
         </w:rPr>
       </w:pPr>
-      <w:hyperlink w:anchor="_Toc234800642" w:history="1">
+      <w:hyperlink w:anchor="_Toc234829235" w:history="1">
         <w:r>
           <w:rPr>
             <w:rStyle w:val="aff8"/>
@@ -3495,7 +3495,7 @@
             <w:noProof/>
             <w:webHidden/>
           </w:rPr>
-          <w:instrText xml:space="preserve"> PAGEREF _Toc234800642 \h </w:instrText>
+          <w:instrText xml:space="preserve"> PAGEREF _Toc234829235 \h </w:instrText>
         </w:r>
         <w:r>
           <w:rPr>
@@ -3515,7 +3515,7 @@
             <w:noProof/>
             <w:webHidden/>
           </w:rPr>
-          <w:t>20</w:t>
+          <w:t>21</w:t>
         </w:r>
         <w:r>
           <w:rPr>
@@ -3542,7 +3542,7 @@
           <w14:ligatures w14:val="standardContextual"/>
         </w:rPr>
       </w:pPr>
-      <w:hyperlink w:anchor="_Toc234800643" w:history="1">
+      <w:hyperlink w:anchor="_Toc234829236" w:history="1">
         <w:r>
           <w:rPr>
             <w:rStyle w:val="aff8"/>
@@ -3570,7 +3570,7 @@
             <w:noProof/>
             <w:webHidden/>
           </w:rPr>
-          <w:instrText xml:space="preserve"> PAGEREF _Toc234800643 \h </w:instrText>
+          <w:instrText xml:space="preserve"> PAGEREF _Toc234829236 \h </w:instrText>
         </w:r>
         <w:r>
           <w:rPr>
@@ -3590,7 +3590,7 @@
             <w:noProof/>
             <w:webHidden/>
           </w:rPr>
-          <w:t>21</w:t>
+          <w:t>22</w:t>
         </w:r>
         <w:r>
           <w:rPr>
@@ -3617,7 +3617,7 @@
           <w14:ligatures w14:val="standardContextual"/>
         </w:rPr>
       </w:pPr>
-      <w:hyperlink w:anchor="_Toc234800644" w:history="1">
+      <w:hyperlink w:anchor="_Toc234829237" w:history="1">
         <w:r>
           <w:rPr>
             <w:rStyle w:val="aff8"/>
@@ -3645,7 +3645,7 @@
             <w:noProof/>
             <w:webHidden/>
           </w:rPr>
-          <w:instrText xml:space="preserve"> PAGEREF _Toc234800644 \h </w:instrText>
+          <w:instrText xml:space="preserve"> PAGEREF _Toc234829237 \h </w:instrText>
         </w:r>
         <w:r>
           <w:rPr>
@@ -3665,7 +3665,7 @@
             <w:noProof/>
             <w:webHidden/>
           </w:rPr>
-          <w:t>21</w:t>
+          <w:t>22</w:t>
         </w:r>
         <w:r>
           <w:rPr>
@@ -3692,7 +3692,7 @@
           <w14:ligatures w14:val="standardContextual"/>
         </w:rPr>
       </w:pPr>
-      <w:hyperlink w:anchor="_Toc234800645" w:history="1">
+      <w:hyperlink w:anchor="_Toc234829238" w:history="1">
         <w:r>
           <w:rPr>
             <w:rStyle w:val="aff8"/>
@@ -3720,7 +3720,7 @@
             <w:noProof/>
             <w:webHidden/>
           </w:rPr>
-          <w:instrText xml:space="preserve"> PAGEREF _Toc234800645 \h </w:instrText>
+          <w:instrText xml:space="preserve"> PAGEREF _Toc234829238 \h </w:instrText>
         </w:r>
         <w:r>
           <w:rPr>
@@ -3740,7 +3740,7 @@
             <w:noProof/>
             <w:webHidden/>
           </w:rPr>
-          <w:t>21</w:t>
+          <w:t>22</w:t>
         </w:r>
         <w:r>
           <w:rPr>
@@ -3767,7 +3767,7 @@
           <w14:ligatures w14:val="standardContextual"/>
         </w:rPr>
       </w:pPr>
-      <w:hyperlink w:anchor="_Toc234800646" w:history="1">
+      <w:hyperlink w:anchor="_Toc234829239" w:history="1">
         <w:r>
           <w:rPr>
             <w:rStyle w:val="aff8"/>
@@ -3795,7 +3795,7 @@
             <w:noProof/>
             <w:webHidden/>
           </w:rPr>
-          <w:instrText xml:space="preserve"> PAGEREF _Toc234800646 \h </w:instrText>
+          <w:instrText xml:space="preserve"> PAGEREF _Toc234829239 \h </w:instrText>
         </w:r>
         <w:r>
           <w:rPr>
@@ -3815,7 +3815,7 @@
             <w:noProof/>
             <w:webHidden/>
           </w:rPr>
-          <w:t>22</w:t>
+          <w:t>23</w:t>
         </w:r>
         <w:r>
           <w:rPr>
@@ -3842,7 +3842,7 @@
           <w14:ligatures w14:val="standardContextual"/>
         </w:rPr>
       </w:pPr>
-      <w:hyperlink w:anchor="_Toc234800647" w:history="1">
+      <w:hyperlink w:anchor="_Toc234829240" w:history="1">
         <w:r>
           <w:rPr>
             <w:rStyle w:val="aff8"/>
@@ -3870,7 +3870,7 @@
             <w:noProof/>
             <w:webHidden/>
           </w:rPr>
-          <w:instrText xml:space="preserve"> PAGEREF _Toc234800647 \h </w:instrText>
+          <w:instrText xml:space="preserve"> PAGEREF _Toc234829240 \h </w:instrText>
         </w:r>
         <w:r>
           <w:rPr>
@@ -3890,7 +3890,7 @@
             <w:noProof/>
             <w:webHidden/>
           </w:rPr>
-          <w:t>23</w:t>
+          <w:t>24</w:t>
         </w:r>
         <w:r>
           <w:rPr>
@@ -3917,7 +3917,7 @@
           <w14:ligatures w14:val="standardContextual"/>
         </w:rPr>
       </w:pPr>
-      <w:hyperlink w:anchor="_Toc234800648" w:history="1">
+      <w:hyperlink w:anchor="_Toc234829241" w:history="1">
         <w:r>
           <w:rPr>
             <w:rStyle w:val="aff8"/>
@@ -3945,7 +3945,7 @@
             <w:noProof/>
             <w:webHidden/>
           </w:rPr>
-          <w:instrText xml:space="preserve"> PAGEREF _Toc234800648 \h </w:instrText>
+          <w:instrText xml:space="preserve"> PAGEREF _Toc234829241 \h </w:instrText>
         </w:r>
         <w:r>
           <w:rPr>
@@ -3965,7 +3965,7 @@
             <w:noProof/>
             <w:webHidden/>
           </w:rPr>
-          <w:t>23</w:t>
+          <w:t>24</w:t>
         </w:r>
         <w:r>
           <w:rPr>
@@ -3992,7 +3992,7 @@
           <w14:ligatures w14:val="standardContextual"/>
         </w:rPr>
       </w:pPr>
-      <w:hyperlink w:anchor="_Toc234800649" w:history="1">
+      <w:hyperlink w:anchor="_Toc234829242" w:history="1">
         <w:r>
           <w:rPr>
             <w:rStyle w:val="aff8"/>
@@ -4020,7 +4020,7 @@
             <w:noProof/>
             <w:webHidden/>
           </w:rPr>
-          <w:instrText xml:space="preserve"> PAGEREF _Toc234800649 \h </w:instrText>
+          <w:instrText xml:space="preserve"> PAGEREF _Toc234829242 \h </w:instrText>
         </w:r>
         <w:r>
           <w:rPr>
@@ -4040,7 +4040,7 @@
             <w:noProof/>
             <w:webHidden/>
           </w:rPr>
-          <w:t>23</w:t>
+          <w:t>24</w:t>
         </w:r>
         <w:r>
           <w:rPr>
@@ -4067,7 +4067,7 @@
           <w14:ligatures w14:val="standardContextual"/>
         </w:rPr>
       </w:pPr>
-      <w:hyperlink w:anchor="_Toc234800650" w:history="1">
+      <w:hyperlink w:anchor="_Toc234829243" w:history="1">
         <w:r>
           <w:rPr>
             <w:rStyle w:val="aff8"/>
@@ -4095,7 +4095,7 @@
             <w:noProof/>
             <w:webHidden/>
           </w:rPr>
-          <w:instrText xml:space="preserve"> PAGEREF _Toc234800650 \h </w:instrText>
+          <w:instrText xml:space="preserve"> PAGEREF _Toc234829243 \h </w:instrText>
         </w:r>
         <w:r>
           <w:rPr>
@@ -4115,7 +4115,7 @@
             <w:noProof/>
             <w:webHidden/>
           </w:rPr>
-          <w:t>23</w:t>
+          <w:t>24</w:t>
         </w:r>
         <w:r>
           <w:rPr>
@@ -4142,7 +4142,7 @@
           <w14:ligatures w14:val="standardContextual"/>
         </w:rPr>
       </w:pPr>
-      <w:hyperlink w:anchor="_Toc234800651" w:history="1">
+      <w:hyperlink w:anchor="_Toc234829244" w:history="1">
         <w:r>
           <w:rPr>
             <w:rStyle w:val="aff8"/>
@@ -4170,7 +4170,7 @@
             <w:noProof/>
             <w:webHidden/>
           </w:rPr>
-          <w:instrText xml:space="preserve"> PAGEREF _Toc234800651 \h </w:instrText>
+          <w:instrText xml:space="preserve"> PAGEREF _Toc234829244 \h </w:instrText>
         </w:r>
         <w:r>
           <w:rPr>
@@ -4190,7 +4190,7 @@
             <w:noProof/>
             <w:webHidden/>
           </w:rPr>
-          <w:t>24</w:t>
+          <w:t>25</w:t>
         </w:r>
         <w:r>
           <w:rPr>
@@ -4217,7 +4217,7 @@
           <w14:ligatures w14:val="standardContextual"/>
         </w:rPr>
       </w:pPr>
-      <w:hyperlink w:anchor="_Toc234800652" w:history="1">
+      <w:hyperlink w:anchor="_Toc234829245" w:history="1">
         <w:r>
           <w:rPr>
             <w:rStyle w:val="aff8"/>
@@ -4245,7 +4245,7 @@
             <w:noProof/>
             <w:webHidden/>
           </w:rPr>
-          <w:instrText xml:space="preserve"> PAGEREF _Toc234800652 \h </w:instrText>
+          <w:instrText xml:space="preserve"> PAGEREF _Toc234829245 \h </w:instrText>
         </w:r>
         <w:r>
           <w:rPr>
@@ -4265,7 +4265,7 @@
             <w:noProof/>
             <w:webHidden/>
           </w:rPr>
-          <w:t>24</w:t>
+          <w:t>25</w:t>
         </w:r>
         <w:r>
           <w:rPr>
@@ -4292,7 +4292,7 @@
           <w14:ligatures w14:val="standardContextual"/>
         </w:rPr>
       </w:pPr>
-      <w:hyperlink w:anchor="_Toc234800653" w:history="1">
+      <w:hyperlink w:anchor="_Toc234829246" w:history="1">
         <w:r>
           <w:rPr>
             <w:rStyle w:val="aff8"/>
@@ -4320,7 +4320,7 @@
             <w:noProof/>
             <w:webHidden/>
           </w:rPr>
-          <w:instrText xml:space="preserve"> PAGEREF _Toc234800653 \h </w:instrText>
+          <w:instrText xml:space="preserve"> PAGEREF _Toc234829246 \h </w:instrText>
         </w:r>
         <w:r>
           <w:rPr>
@@ -4340,7 +4340,7 @@
             <w:noProof/>
             <w:webHidden/>
           </w:rPr>
-          <w:t>24</w:t>
+          <w:t>25</w:t>
         </w:r>
         <w:r>
           <w:rPr>
@@ -4367,7 +4367,7 @@
           <w14:ligatures w14:val="standardContextual"/>
         </w:rPr>
       </w:pPr>
-      <w:hyperlink w:anchor="_Toc234800654" w:history="1">
+      <w:hyperlink w:anchor="_Toc234829247" w:history="1">
         <w:r>
           <w:rPr>
             <w:rStyle w:val="aff8"/>
@@ -4395,7 +4395,7 @@
             <w:noProof/>
             <w:webHidden/>
           </w:rPr>
-          <w:instrText xml:space="preserve"> PAGEREF _Toc234800654 \h </w:instrText>
+          <w:instrText xml:space="preserve"> PAGEREF _Toc234829247 \h </w:instrText>
         </w:r>
         <w:r>
           <w:rPr>
@@ -4415,7 +4415,7 @@
             <w:noProof/>
             <w:webHidden/>
           </w:rPr>
-          <w:t>24</w:t>
+          <w:t>25</w:t>
         </w:r>
         <w:r>
           <w:rPr>
@@ -4442,7 +4442,7 @@
           <w14:ligatures w14:val="standardContextual"/>
         </w:rPr>
       </w:pPr>
-      <w:hyperlink w:anchor="_Toc234800655" w:history="1">
+      <w:hyperlink w:anchor="_Toc234829248" w:history="1">
         <w:r>
           <w:rPr>
             <w:rStyle w:val="aff8"/>
@@ -4470,7 +4470,7 @@
             <w:noProof/>
             <w:webHidden/>
           </w:rPr>
-          <w:instrText xml:space="preserve"> PAGEREF _Toc234800655 \h </w:instrText>
+          <w:instrText xml:space="preserve"> PAGEREF _Toc234829248 \h </w:instrText>
         </w:r>
         <w:r>
           <w:rPr>
@@ -4490,7 +4490,7 @@
             <w:noProof/>
             <w:webHidden/>
           </w:rPr>
-          <w:t>25</w:t>
+          <w:t>26</w:t>
         </w:r>
         <w:r>
           <w:rPr>
@@ -4517,7 +4517,7 @@
           <w14:ligatures w14:val="standardContextual"/>
         </w:rPr>
       </w:pPr>
-      <w:hyperlink w:anchor="_Toc234800656" w:history="1">
+      <w:hyperlink w:anchor="_Toc234829249" w:history="1">
         <w:r>
           <w:rPr>
             <w:rStyle w:val="aff8"/>
@@ -4545,7 +4545,7 @@
             <w:noProof/>
             <w:webHidden/>
           </w:rPr>
-          <w:instrText xml:space="preserve"> PAGEREF _Toc234800656 \h </w:instrText>
+          <w:instrText xml:space="preserve"> PAGEREF _Toc234829249 \h </w:instrText>
         </w:r>
         <w:r>
           <w:rPr>
@@ -4565,7 +4565,7 @@
             <w:noProof/>
             <w:webHidden/>
           </w:rPr>
-          <w:t>26</w:t>
+          <w:t>27</w:t>
         </w:r>
         <w:r>
           <w:rPr>
@@ -4592,7 +4592,7 @@
           <w14:ligatures w14:val="standardContextual"/>
         </w:rPr>
       </w:pPr>
-      <w:hyperlink w:anchor="_Toc234800657" w:history="1">
+      <w:hyperlink w:anchor="_Toc234829250" w:history="1">
         <w:r>
           <w:rPr>
             <w:rStyle w:val="aff8"/>
@@ -4620,7 +4620,7 @@
             <w:noProof/>
             <w:webHidden/>
           </w:rPr>
-          <w:instrText xml:space="preserve"> PAGEREF _Toc234800657 \h </w:instrText>
+          <w:instrText xml:space="preserve"> PAGEREF _Toc234829250 \h </w:instrText>
         </w:r>
         <w:r>
           <w:rPr>
@@ -4640,7 +4640,7 @@
             <w:noProof/>
             <w:webHidden/>
           </w:rPr>
-          <w:t>28</w:t>
+          <w:t>29</w:t>
         </w:r>
         <w:r>
           <w:rPr>
@@ -4667,7 +4667,7 @@
           <w14:ligatures w14:val="standardContextual"/>
         </w:rPr>
       </w:pPr>
-      <w:hyperlink w:anchor="_Toc234800658" w:history="1">
+      <w:hyperlink w:anchor="_Toc234829251" w:history="1">
         <w:r>
           <w:rPr>
             <w:rStyle w:val="aff8"/>
@@ -4695,7 +4695,7 @@
             <w:noProof/>
             <w:webHidden/>
           </w:rPr>
-          <w:instrText xml:space="preserve"> PAGEREF _Toc234800658 \h </w:instrText>
+          <w:instrText xml:space="preserve"> PAGEREF _Toc234829251 \h </w:instrText>
         </w:r>
         <w:r>
           <w:rPr>
@@ -4715,7 +4715,7 @@
             <w:noProof/>
             <w:webHidden/>
           </w:rPr>
-          <w:t>29</w:t>
+          <w:t>30</w:t>
         </w:r>
         <w:r>
           <w:rPr>
@@ -4742,7 +4742,7 @@
           <w14:ligatures w14:val="standardContextual"/>
         </w:rPr>
       </w:pPr>
-      <w:hyperlink w:anchor="_Toc234800659" w:history="1">
+      <w:hyperlink w:anchor="_Toc234829252" w:history="1">
         <w:r>
           <w:rPr>
             <w:rStyle w:val="aff8"/>
@@ -4770,7 +4770,7 @@
             <w:noProof/>
             <w:webHidden/>
           </w:rPr>
-          <w:instrText xml:space="preserve"> PAGEREF _Toc234800659 \h </w:instrText>
+          <w:instrText xml:space="preserve"> PAGEREF _Toc234829252 \h </w:instrText>
         </w:r>
         <w:r>
           <w:rPr>
@@ -4790,7 +4790,7 @@
             <w:noProof/>
             <w:webHidden/>
           </w:rPr>
-          <w:t>30</w:t>
+          <w:t>31</w:t>
         </w:r>
         <w:r>
           <w:rPr>
@@ -4817,7 +4817,7 @@
         <w:pStyle w:val="1"/>
         <w:pageBreakBefore/>
       </w:pPr>
-      <w:bookmarkStart w:id="2" w:name="_Toc234800618"/>
+      <w:bookmarkStart w:id="2" w:name="_Toc234829211"/>
       <w:r>
         <w:rPr>
           <w:rFonts w:ascii="Times New Roman" w:eastAsia="Times New Roman" w:hAnsi="Times New Roman" w:cs="Times New Roman"/>
@@ -4942,7 +4942,7 @@
         <w:pStyle w:val="1"/>
         <w:pageBreakBefore/>
       </w:pPr>
-      <w:bookmarkStart w:id="3" w:name="_Toc234800619"/>
+      <w:bookmarkStart w:id="3" w:name="_Toc234829212"/>
       <w:r>
         <w:rPr>
           <w:rFonts w:ascii="Times New Roman" w:eastAsia="Times New Roman" w:hAnsi="Times New Roman" w:cs="Times New Roman"/>
@@ -4956,7 +4956,7 @@
       <w:pPr>
         <w:pStyle w:val="21"/>
       </w:pPr>
-      <w:bookmarkStart w:id="4" w:name="_Toc234800620"/>
+      <w:bookmarkStart w:id="4" w:name="_Toc234829213"/>
       <w:r>
         <w:rPr>
           <w:rFonts w:ascii="Times New Roman" w:eastAsia="Times New Roman" w:hAnsi="Times New Roman" w:cs="Times New Roman"/>
@@ -5422,7 +5422,7 @@
       <w:pPr>
         <w:pStyle w:val="21"/>
       </w:pPr>
-      <w:bookmarkStart w:id="5" w:name="_Toc234800621"/>
+      <w:bookmarkStart w:id="5" w:name="_Toc234829214"/>
       <w:r>
         <w:rPr>
           <w:rFonts w:ascii="Times New Roman" w:eastAsia="Times New Roman" w:hAnsi="Times New Roman" w:cs="Times New Roman"/>
@@ -5464,7 +5464,7 @@
       <w:pPr>
         <w:pStyle w:val="21"/>
       </w:pPr>
-      <w:bookmarkStart w:id="6" w:name="_Toc234800622"/>
+      <w:bookmarkStart w:id="6" w:name="_Toc234829215"/>
       <w:r>
         <w:rPr>
           <w:rFonts w:ascii="Times New Roman" w:eastAsia="Times New Roman" w:hAnsi="Times New Roman" w:cs="Times New Roman"/>
@@ -5878,7 +5878,7 @@
       <w:pPr>
         <w:pStyle w:val="21"/>
       </w:pPr>
-      <w:bookmarkStart w:id="7" w:name="_Toc234800623"/>
+      <w:bookmarkStart w:id="7" w:name="_Toc234829216"/>
       <w:r>
         <w:rPr>
           <w:rFonts w:ascii="Times New Roman" w:eastAsia="Times New Roman" w:hAnsi="Times New Roman" w:cs="Times New Roman"/>
@@ -6662,7 +6662,7 @@
         <w:pStyle w:val="1"/>
         <w:pageBreakBefore/>
       </w:pPr>
-      <w:bookmarkStart w:id="8" w:name="_Toc234800624"/>
+      <w:bookmarkStart w:id="8" w:name="_Toc234829217"/>
       <w:r>
         <w:rPr>
           <w:rFonts w:ascii="Times New Roman" w:eastAsia="Times New Roman" w:hAnsi="Times New Roman" w:cs="Times New Roman"/>
@@ -6676,7 +6676,7 @@
       <w:pPr>
         <w:pStyle w:val="21"/>
       </w:pPr>
-      <w:bookmarkStart w:id="9" w:name="_Toc234800625"/>
+      <w:bookmarkStart w:id="9" w:name="_Toc234829218"/>
       <w:r>
         <w:rPr>
           <w:rFonts w:ascii="Times New Roman" w:eastAsia="Times New Roman" w:hAnsi="Times New Roman" w:cs="Times New Roman"/>
@@ -6717,7 +6717,7 @@
       <w:pPr>
         <w:pStyle w:val="21"/>
       </w:pPr>
-      <w:bookmarkStart w:id="10" w:name="_Toc234800626"/>
+      <w:bookmarkStart w:id="10" w:name="_Toc234829219"/>
       <w:r>
         <w:rPr>
           <w:rFonts w:ascii="Times New Roman" w:eastAsia="Times New Roman" w:hAnsi="Times New Roman" w:cs="Times New Roman"/>
@@ -6818,7 +6818,7 @@
       <w:pPr>
         <w:pStyle w:val="21"/>
       </w:pPr>
-      <w:bookmarkStart w:id="11" w:name="_Toc234800627"/>
+      <w:bookmarkStart w:id="11" w:name="_Toc234829220"/>
       <w:r>
         <w:rPr>
           <w:rFonts w:ascii="Times New Roman" w:eastAsia="Times New Roman" w:hAnsi="Times New Roman" w:cs="Times New Roman"/>
@@ -6839,7 +6839,7 @@
           <w:noProof/>
         </w:rPr>
         <w:drawing>
-          <wp:inline distT="0" distB="0" distL="0" distR="0" wp14:anchorId="6A6E5523" wp14:editId="25C515BB">
+          <wp:inline distT="0" distB="0" distL="0" distR="0" wp14:anchorId="5F1FB302" wp14:editId="5E2345D7">
             <wp:extent cx="5202465" cy="6217919"/>
             <wp:effectExtent l="0" t="0" r="0" b="0"/>
             <wp:docPr id="2" name="Picture 2" descr="Рисунок 1 – Варианты использования ThermoSelect"/>
@@ -6904,7 +6904,7 @@
       <w:pPr>
         <w:pStyle w:val="21"/>
       </w:pPr>
-      <w:bookmarkStart w:id="12" w:name="_Toc234800628"/>
+      <w:bookmarkStart w:id="12" w:name="_Toc234829221"/>
       <w:r>
         <w:rPr>
           <w:rFonts w:ascii="Times New Roman" w:eastAsia="Times New Roman" w:hAnsi="Times New Roman" w:cs="Times New Roman"/>
@@ -6940,7 +6940,7 @@
       <w:pPr>
         <w:pStyle w:val="21"/>
       </w:pPr>
-      <w:bookmarkStart w:id="13" w:name="_Toc234800629"/>
+      <w:bookmarkStart w:id="13" w:name="_Toc234829222"/>
       <w:r>
         <w:rPr>
           <w:rFonts w:ascii="Times New Roman" w:eastAsia="Times New Roman" w:hAnsi="Times New Roman" w:cs="Times New Roman"/>
@@ -7553,7 +7553,7 @@
       <w:pPr>
         <w:pStyle w:val="21"/>
       </w:pPr>
-      <w:bookmarkStart w:id="14" w:name="_Toc234800630"/>
+      <w:bookmarkStart w:id="14" w:name="_Toc234829223"/>
       <w:r>
         <w:rPr>
           <w:rFonts w:ascii="Times New Roman" w:eastAsia="Times New Roman" w:hAnsi="Times New Roman" w:cs="Times New Roman"/>
@@ -8717,7 +8717,7 @@
       <w:pPr>
         <w:pStyle w:val="21"/>
       </w:pPr>
-      <w:bookmarkStart w:id="15" w:name="_Toc234800631"/>
+      <w:bookmarkStart w:id="15" w:name="_Toc234829224"/>
       <w:r>
         <w:rPr>
           <w:rFonts w:ascii="Times New Roman" w:eastAsia="Times New Roman" w:hAnsi="Times New Roman" w:cs="Times New Roman"/>
@@ -8731,14 +8731,1143 @@
         <w:rPr>
           <w:rFonts w:cs="Times New Roman"/>
         </w:rPr>
-        <w:t xml:space="preserve">В качестве серверных аналогов рассматривались NestJS и ASP.NET Core. NestJS позволил бы использовать JavaScript или TypeScript на обоих уровнях и </w:t>
+        <w:t xml:space="preserve">Backend-стек выбирался с нуля между Spring Boot, NestJS и ASP.NET Core. Все три варианта позволяют построить REST API, применить dependency </w:t>
       </w:r>
       <w:r>
         <w:rPr>
           <w:rFonts w:cs="Times New Roman"/>
         </w:rPr>
         <w:lastRenderedPageBreak/>
-        <w:t>предоставляет модули, guards, validation и средства тестирования. ASP.NET Core является зрелым кроссплатформенным framework с dependency injection, средствами безопасности и производительным web-сервером. Оба варианта технически пригодны.</w:t>
+        <w:t>injection, выполнить валидацию и покрыть приложение автоматическими тестами. Для сравнения использована шкала от 1 до 5. Наибольший вес получили безопасность и транзакционная работа с реляционными данными, а требование единого исполняемого JAR рассматривалось как обязательное условие поставки.</w:t>
+      </w:r>
+    </w:p>
+    <w:tbl>
+      <w:tblPr>
+        <w:tblStyle w:val="aff0"/>
+        <w:tblW w:w="9690" w:type="dxa"/>
+        <w:tblInd w:w="120" w:type="dxa"/>
+        <w:tblLayout w:type="fixed"/>
+        <w:tblLook w:val="04A0" w:firstRow="1" w:lastRow="0" w:firstColumn="1" w:lastColumn="0" w:noHBand="0" w:noVBand="1"/>
+      </w:tblPr>
+      <w:tblGrid>
+        <w:gridCol w:w="4344"/>
+        <w:gridCol w:w="1337"/>
+        <w:gridCol w:w="1337"/>
+        <w:gridCol w:w="1337"/>
+        <w:gridCol w:w="1335"/>
+      </w:tblGrid>
+      <w:tr>
+        <w:trPr>
+          <w:cantSplit/>
+          <w:tblHeader/>
+        </w:trPr>
+        <w:tc>
+          <w:tcPr>
+            <w:tcW w:w="4344" w:type="dxa"/>
+            <w:shd w:val="clear" w:color="auto" w:fill="E7E7E7"/>
+            <w:tcMar>
+              <w:top w:w="100" w:type="dxa"/>
+              <w:left w:w="120" w:type="dxa"/>
+              <w:bottom w:w="100" w:type="dxa"/>
+              <w:right w:w="120" w:type="dxa"/>
+            </w:tcMar>
+            <w:vAlign w:val="center"/>
+          </w:tcPr>
+          <w:p>
+            <w:pPr>
+              <w:spacing w:line="240" w:lineRule="auto"/>
+              <w:ind w:firstLine="0"/>
+              <w:jc w:val="center"/>
+            </w:pPr>
+            <w:r>
+              <w:rPr>
+                <w:rFonts w:cs="Times New Roman"/>
+                <w:b/>
+                <w:sz w:val="22"/>
+              </w:rPr>
+              <w:t>Критерий</w:t>
+            </w:r>
+          </w:p>
+        </w:tc>
+        <w:tc>
+          <w:tcPr>
+            <w:tcW w:w="1337" w:type="dxa"/>
+            <w:shd w:val="clear" w:color="auto" w:fill="E7E7E7"/>
+            <w:tcMar>
+              <w:top w:w="100" w:type="dxa"/>
+              <w:left w:w="120" w:type="dxa"/>
+              <w:bottom w:w="100" w:type="dxa"/>
+              <w:right w:w="120" w:type="dxa"/>
+            </w:tcMar>
+            <w:vAlign w:val="center"/>
+          </w:tcPr>
+          <w:p>
+            <w:pPr>
+              <w:spacing w:line="240" w:lineRule="auto"/>
+              <w:ind w:firstLine="0"/>
+              <w:jc w:val="center"/>
+            </w:pPr>
+            <w:r>
+              <w:rPr>
+                <w:rFonts w:cs="Times New Roman"/>
+                <w:b/>
+                <w:sz w:val="22"/>
+              </w:rPr>
+              <w:t>Вес, %</w:t>
+            </w:r>
+          </w:p>
+        </w:tc>
+        <w:tc>
+          <w:tcPr>
+            <w:tcW w:w="1337" w:type="dxa"/>
+            <w:shd w:val="clear" w:color="auto" w:fill="E7E7E7"/>
+            <w:tcMar>
+              <w:top w:w="100" w:type="dxa"/>
+              <w:left w:w="120" w:type="dxa"/>
+              <w:bottom w:w="100" w:type="dxa"/>
+              <w:right w:w="120" w:type="dxa"/>
+            </w:tcMar>
+            <w:vAlign w:val="center"/>
+          </w:tcPr>
+          <w:p>
+            <w:pPr>
+              <w:spacing w:line="240" w:lineRule="auto"/>
+              <w:ind w:firstLine="0"/>
+              <w:jc w:val="center"/>
+            </w:pPr>
+            <w:r>
+              <w:rPr>
+                <w:rFonts w:cs="Times New Roman"/>
+                <w:b/>
+                <w:sz w:val="22"/>
+              </w:rPr>
+              <w:t>Spring Boot</w:t>
+            </w:r>
+          </w:p>
+        </w:tc>
+        <w:tc>
+          <w:tcPr>
+            <w:tcW w:w="1337" w:type="dxa"/>
+            <w:shd w:val="clear" w:color="auto" w:fill="E7E7E7"/>
+            <w:tcMar>
+              <w:top w:w="100" w:type="dxa"/>
+              <w:left w:w="120" w:type="dxa"/>
+              <w:bottom w:w="100" w:type="dxa"/>
+              <w:right w:w="120" w:type="dxa"/>
+            </w:tcMar>
+            <w:vAlign w:val="center"/>
+          </w:tcPr>
+          <w:p>
+            <w:pPr>
+              <w:spacing w:line="240" w:lineRule="auto"/>
+              <w:ind w:firstLine="0"/>
+              <w:jc w:val="center"/>
+            </w:pPr>
+            <w:r>
+              <w:rPr>
+                <w:rFonts w:cs="Times New Roman"/>
+                <w:b/>
+                <w:sz w:val="22"/>
+              </w:rPr>
+              <w:t>NestJS</w:t>
+            </w:r>
+          </w:p>
+        </w:tc>
+        <w:tc>
+          <w:tcPr>
+            <w:tcW w:w="1335" w:type="dxa"/>
+            <w:shd w:val="clear" w:color="auto" w:fill="E7E7E7"/>
+            <w:tcMar>
+              <w:top w:w="100" w:type="dxa"/>
+              <w:left w:w="120" w:type="dxa"/>
+              <w:bottom w:w="100" w:type="dxa"/>
+              <w:right w:w="120" w:type="dxa"/>
+            </w:tcMar>
+            <w:vAlign w:val="center"/>
+          </w:tcPr>
+          <w:p>
+            <w:pPr>
+              <w:spacing w:line="240" w:lineRule="auto"/>
+              <w:ind w:firstLine="0"/>
+              <w:jc w:val="center"/>
+            </w:pPr>
+            <w:r>
+              <w:rPr>
+                <w:rFonts w:cs="Times New Roman"/>
+                <w:b/>
+                <w:sz w:val="22"/>
+              </w:rPr>
+              <w:t>ASP.NET Core</w:t>
+            </w:r>
+          </w:p>
+        </w:tc>
+      </w:tr>
+      <w:tr>
+        <w:trPr>
+          <w:cantSplit/>
+        </w:trPr>
+        <w:tc>
+          <w:tcPr>
+            <w:tcW w:w="4344" w:type="dxa"/>
+            <w:tcMar>
+              <w:top w:w="100" w:type="dxa"/>
+              <w:left w:w="120" w:type="dxa"/>
+              <w:bottom w:w="100" w:type="dxa"/>
+              <w:right w:w="120" w:type="dxa"/>
+            </w:tcMar>
+            <w:vAlign w:val="center"/>
+          </w:tcPr>
+          <w:p>
+            <w:pPr>
+              <w:spacing w:line="240" w:lineRule="auto"/>
+              <w:ind w:firstLine="0"/>
+              <w:jc w:val="left"/>
+            </w:pPr>
+            <w:r>
+              <w:rPr>
+                <w:rFonts w:cs="Times New Roman"/>
+                <w:sz w:val="22"/>
+              </w:rPr>
+              <w:t>Session-аутентификация, CSRF и роли</w:t>
+            </w:r>
+          </w:p>
+        </w:tc>
+        <w:tc>
+          <w:tcPr>
+            <w:tcW w:w="1337" w:type="dxa"/>
+            <w:tcMar>
+              <w:top w:w="100" w:type="dxa"/>
+              <w:left w:w="120" w:type="dxa"/>
+              <w:bottom w:w="100" w:type="dxa"/>
+              <w:right w:w="120" w:type="dxa"/>
+            </w:tcMar>
+            <w:vAlign w:val="center"/>
+          </w:tcPr>
+          <w:p>
+            <w:pPr>
+              <w:spacing w:line="240" w:lineRule="auto"/>
+              <w:ind w:firstLine="0"/>
+              <w:jc w:val="left"/>
+            </w:pPr>
+            <w:r>
+              <w:rPr>
+                <w:rFonts w:cs="Times New Roman"/>
+                <w:sz w:val="22"/>
+              </w:rPr>
+              <w:t>25</w:t>
+            </w:r>
+          </w:p>
+        </w:tc>
+        <w:tc>
+          <w:tcPr>
+            <w:tcW w:w="1337" w:type="dxa"/>
+            <w:tcMar>
+              <w:top w:w="100" w:type="dxa"/>
+              <w:left w:w="120" w:type="dxa"/>
+              <w:bottom w:w="100" w:type="dxa"/>
+              <w:right w:w="120" w:type="dxa"/>
+            </w:tcMar>
+            <w:vAlign w:val="center"/>
+          </w:tcPr>
+          <w:p>
+            <w:pPr>
+              <w:spacing w:line="240" w:lineRule="auto"/>
+              <w:ind w:firstLine="0"/>
+              <w:jc w:val="left"/>
+            </w:pPr>
+            <w:r>
+              <w:rPr>
+                <w:rFonts w:cs="Times New Roman"/>
+                <w:sz w:val="22"/>
+              </w:rPr>
+              <w:t>5</w:t>
+            </w:r>
+          </w:p>
+        </w:tc>
+        <w:tc>
+          <w:tcPr>
+            <w:tcW w:w="1337" w:type="dxa"/>
+            <w:tcMar>
+              <w:top w:w="100" w:type="dxa"/>
+              <w:left w:w="120" w:type="dxa"/>
+              <w:bottom w:w="100" w:type="dxa"/>
+              <w:right w:w="120" w:type="dxa"/>
+            </w:tcMar>
+            <w:vAlign w:val="center"/>
+          </w:tcPr>
+          <w:p>
+            <w:pPr>
+              <w:spacing w:line="240" w:lineRule="auto"/>
+              <w:ind w:firstLine="0"/>
+              <w:jc w:val="left"/>
+            </w:pPr>
+            <w:r>
+              <w:rPr>
+                <w:rFonts w:cs="Times New Roman"/>
+                <w:sz w:val="22"/>
+              </w:rPr>
+              <w:t>3</w:t>
+            </w:r>
+          </w:p>
+        </w:tc>
+        <w:tc>
+          <w:tcPr>
+            <w:tcW w:w="1335" w:type="dxa"/>
+            <w:tcMar>
+              <w:top w:w="100" w:type="dxa"/>
+              <w:left w:w="120" w:type="dxa"/>
+              <w:bottom w:w="100" w:type="dxa"/>
+              <w:right w:w="120" w:type="dxa"/>
+            </w:tcMar>
+            <w:vAlign w:val="center"/>
+          </w:tcPr>
+          <w:p>
+            <w:pPr>
+              <w:spacing w:line="240" w:lineRule="auto"/>
+              <w:ind w:firstLine="0"/>
+              <w:jc w:val="left"/>
+            </w:pPr>
+            <w:r>
+              <w:rPr>
+                <w:rFonts w:cs="Times New Roman"/>
+                <w:sz w:val="22"/>
+              </w:rPr>
+              <w:t>5</w:t>
+            </w:r>
+          </w:p>
+        </w:tc>
+      </w:tr>
+      <w:tr>
+        <w:trPr>
+          <w:cantSplit/>
+        </w:trPr>
+        <w:tc>
+          <w:tcPr>
+            <w:tcW w:w="4344" w:type="dxa"/>
+            <w:tcMar>
+              <w:top w:w="100" w:type="dxa"/>
+              <w:left w:w="120" w:type="dxa"/>
+              <w:bottom w:w="100" w:type="dxa"/>
+              <w:right w:w="120" w:type="dxa"/>
+            </w:tcMar>
+            <w:vAlign w:val="center"/>
+          </w:tcPr>
+          <w:p>
+            <w:pPr>
+              <w:spacing w:line="240" w:lineRule="auto"/>
+              <w:ind w:firstLine="0"/>
+              <w:jc w:val="left"/>
+            </w:pPr>
+            <w:r>
+              <w:rPr>
+                <w:rFonts w:cs="Times New Roman"/>
+                <w:sz w:val="22"/>
+              </w:rPr>
+              <w:t>Транзакции и реляционная модель</w:t>
+            </w:r>
+          </w:p>
+        </w:tc>
+        <w:tc>
+          <w:tcPr>
+            <w:tcW w:w="1337" w:type="dxa"/>
+            <w:tcMar>
+              <w:top w:w="100" w:type="dxa"/>
+              <w:left w:w="120" w:type="dxa"/>
+              <w:bottom w:w="100" w:type="dxa"/>
+              <w:right w:w="120" w:type="dxa"/>
+            </w:tcMar>
+            <w:vAlign w:val="center"/>
+          </w:tcPr>
+          <w:p>
+            <w:pPr>
+              <w:spacing w:line="240" w:lineRule="auto"/>
+              <w:ind w:firstLine="0"/>
+              <w:jc w:val="left"/>
+            </w:pPr>
+            <w:r>
+              <w:rPr>
+                <w:rFonts w:cs="Times New Roman"/>
+                <w:sz w:val="22"/>
+              </w:rPr>
+              <w:t>20</w:t>
+            </w:r>
+          </w:p>
+        </w:tc>
+        <w:tc>
+          <w:tcPr>
+            <w:tcW w:w="1337" w:type="dxa"/>
+            <w:tcMar>
+              <w:top w:w="100" w:type="dxa"/>
+              <w:left w:w="120" w:type="dxa"/>
+              <w:bottom w:w="100" w:type="dxa"/>
+              <w:right w:w="120" w:type="dxa"/>
+            </w:tcMar>
+            <w:vAlign w:val="center"/>
+          </w:tcPr>
+          <w:p>
+            <w:pPr>
+              <w:spacing w:line="240" w:lineRule="auto"/>
+              <w:ind w:firstLine="0"/>
+              <w:jc w:val="left"/>
+            </w:pPr>
+            <w:r>
+              <w:rPr>
+                <w:rFonts w:cs="Times New Roman"/>
+                <w:sz w:val="22"/>
+              </w:rPr>
+              <w:t>5</w:t>
+            </w:r>
+          </w:p>
+        </w:tc>
+        <w:tc>
+          <w:tcPr>
+            <w:tcW w:w="1337" w:type="dxa"/>
+            <w:tcMar>
+              <w:top w:w="100" w:type="dxa"/>
+              <w:left w:w="120" w:type="dxa"/>
+              <w:bottom w:w="100" w:type="dxa"/>
+              <w:right w:w="120" w:type="dxa"/>
+            </w:tcMar>
+            <w:vAlign w:val="center"/>
+          </w:tcPr>
+          <w:p>
+            <w:pPr>
+              <w:spacing w:line="240" w:lineRule="auto"/>
+              <w:ind w:firstLine="0"/>
+              <w:jc w:val="left"/>
+            </w:pPr>
+            <w:r>
+              <w:rPr>
+                <w:rFonts w:cs="Times New Roman"/>
+                <w:sz w:val="22"/>
+              </w:rPr>
+              <w:t>4</w:t>
+            </w:r>
+          </w:p>
+        </w:tc>
+        <w:tc>
+          <w:tcPr>
+            <w:tcW w:w="1335" w:type="dxa"/>
+            <w:tcMar>
+              <w:top w:w="100" w:type="dxa"/>
+              <w:left w:w="120" w:type="dxa"/>
+              <w:bottom w:w="100" w:type="dxa"/>
+              <w:right w:w="120" w:type="dxa"/>
+            </w:tcMar>
+            <w:vAlign w:val="center"/>
+          </w:tcPr>
+          <w:p>
+            <w:pPr>
+              <w:spacing w:line="240" w:lineRule="auto"/>
+              <w:ind w:firstLine="0"/>
+              <w:jc w:val="left"/>
+            </w:pPr>
+            <w:r>
+              <w:rPr>
+                <w:rFonts w:cs="Times New Roman"/>
+                <w:sz w:val="22"/>
+              </w:rPr>
+              <w:t>5</w:t>
+            </w:r>
+          </w:p>
+        </w:tc>
+      </w:tr>
+      <w:tr>
+        <w:trPr>
+          <w:cantSplit/>
+        </w:trPr>
+        <w:tc>
+          <w:tcPr>
+            <w:tcW w:w="4344" w:type="dxa"/>
+            <w:tcMar>
+              <w:top w:w="100" w:type="dxa"/>
+              <w:left w:w="120" w:type="dxa"/>
+              <w:bottom w:w="100" w:type="dxa"/>
+              <w:right w:w="120" w:type="dxa"/>
+            </w:tcMar>
+            <w:vAlign w:val="center"/>
+          </w:tcPr>
+          <w:p>
+            <w:pPr>
+              <w:spacing w:line="240" w:lineRule="auto"/>
+              <w:ind w:firstLine="0"/>
+              <w:jc w:val="left"/>
+            </w:pPr>
+            <w:r>
+              <w:rPr>
+                <w:rFonts w:cs="Times New Roman"/>
+                <w:sz w:val="22"/>
+              </w:rPr>
+              <w:t>Сборка в исполняемый JAR</w:t>
+            </w:r>
+          </w:p>
+        </w:tc>
+        <w:tc>
+          <w:tcPr>
+            <w:tcW w:w="1337" w:type="dxa"/>
+            <w:tcMar>
+              <w:top w:w="100" w:type="dxa"/>
+              <w:left w:w="120" w:type="dxa"/>
+              <w:bottom w:w="100" w:type="dxa"/>
+              <w:right w:w="120" w:type="dxa"/>
+            </w:tcMar>
+            <w:vAlign w:val="center"/>
+          </w:tcPr>
+          <w:p>
+            <w:pPr>
+              <w:spacing w:line="240" w:lineRule="auto"/>
+              <w:ind w:firstLine="0"/>
+              <w:jc w:val="left"/>
+            </w:pPr>
+            <w:r>
+              <w:rPr>
+                <w:rFonts w:cs="Times New Roman"/>
+                <w:sz w:val="22"/>
+              </w:rPr>
+              <w:t>20</w:t>
+            </w:r>
+          </w:p>
+        </w:tc>
+        <w:tc>
+          <w:tcPr>
+            <w:tcW w:w="1337" w:type="dxa"/>
+            <w:tcMar>
+              <w:top w:w="100" w:type="dxa"/>
+              <w:left w:w="120" w:type="dxa"/>
+              <w:bottom w:w="100" w:type="dxa"/>
+              <w:right w:w="120" w:type="dxa"/>
+            </w:tcMar>
+            <w:vAlign w:val="center"/>
+          </w:tcPr>
+          <w:p>
+            <w:pPr>
+              <w:spacing w:line="240" w:lineRule="auto"/>
+              <w:ind w:firstLine="0"/>
+              <w:jc w:val="left"/>
+            </w:pPr>
+            <w:r>
+              <w:rPr>
+                <w:rFonts w:cs="Times New Roman"/>
+                <w:sz w:val="22"/>
+              </w:rPr>
+              <w:t>5</w:t>
+            </w:r>
+          </w:p>
+        </w:tc>
+        <w:tc>
+          <w:tcPr>
+            <w:tcW w:w="1337" w:type="dxa"/>
+            <w:tcMar>
+              <w:top w:w="100" w:type="dxa"/>
+              <w:left w:w="120" w:type="dxa"/>
+              <w:bottom w:w="100" w:type="dxa"/>
+              <w:right w:w="120" w:type="dxa"/>
+            </w:tcMar>
+            <w:vAlign w:val="center"/>
+          </w:tcPr>
+          <w:p>
+            <w:pPr>
+              <w:spacing w:line="240" w:lineRule="auto"/>
+              <w:ind w:firstLine="0"/>
+              <w:jc w:val="left"/>
+            </w:pPr>
+            <w:r>
+              <w:rPr>
+                <w:rFonts w:cs="Times New Roman"/>
+                <w:sz w:val="22"/>
+              </w:rPr>
+              <w:t>1</w:t>
+            </w:r>
+          </w:p>
+        </w:tc>
+        <w:tc>
+          <w:tcPr>
+            <w:tcW w:w="1335" w:type="dxa"/>
+            <w:tcMar>
+              <w:top w:w="100" w:type="dxa"/>
+              <w:left w:w="120" w:type="dxa"/>
+              <w:bottom w:w="100" w:type="dxa"/>
+              <w:right w:w="120" w:type="dxa"/>
+            </w:tcMar>
+            <w:vAlign w:val="center"/>
+          </w:tcPr>
+          <w:p>
+            <w:pPr>
+              <w:spacing w:line="240" w:lineRule="auto"/>
+              <w:ind w:firstLine="0"/>
+              <w:jc w:val="left"/>
+            </w:pPr>
+            <w:r>
+              <w:rPr>
+                <w:rFonts w:cs="Times New Roman"/>
+                <w:sz w:val="22"/>
+              </w:rPr>
+              <w:t>1</w:t>
+            </w:r>
+          </w:p>
+        </w:tc>
+      </w:tr>
+      <w:tr>
+        <w:trPr>
+          <w:cantSplit/>
+        </w:trPr>
+        <w:tc>
+          <w:tcPr>
+            <w:tcW w:w="4344" w:type="dxa"/>
+            <w:tcMar>
+              <w:top w:w="100" w:type="dxa"/>
+              <w:left w:w="120" w:type="dxa"/>
+              <w:bottom w:w="100" w:type="dxa"/>
+              <w:right w:w="120" w:type="dxa"/>
+            </w:tcMar>
+            <w:vAlign w:val="center"/>
+          </w:tcPr>
+          <w:p>
+            <w:pPr>
+              <w:spacing w:line="240" w:lineRule="auto"/>
+              <w:ind w:firstLine="0"/>
+              <w:jc w:val="left"/>
+            </w:pPr>
+            <w:r>
+              <w:rPr>
+                <w:rFonts w:cs="Times New Roman"/>
+                <w:sz w:val="22"/>
+              </w:rPr>
+              <w:t>Статическая типизация предметной модели</w:t>
+            </w:r>
+          </w:p>
+        </w:tc>
+        <w:tc>
+          <w:tcPr>
+            <w:tcW w:w="1337" w:type="dxa"/>
+            <w:tcMar>
+              <w:top w:w="100" w:type="dxa"/>
+              <w:left w:w="120" w:type="dxa"/>
+              <w:bottom w:w="100" w:type="dxa"/>
+              <w:right w:w="120" w:type="dxa"/>
+            </w:tcMar>
+            <w:vAlign w:val="center"/>
+          </w:tcPr>
+          <w:p>
+            <w:pPr>
+              <w:spacing w:line="240" w:lineRule="auto"/>
+              <w:ind w:firstLine="0"/>
+              <w:jc w:val="left"/>
+            </w:pPr>
+            <w:r>
+              <w:rPr>
+                <w:rFonts w:cs="Times New Roman"/>
+                <w:sz w:val="22"/>
+              </w:rPr>
+              <w:t>15</w:t>
+            </w:r>
+          </w:p>
+        </w:tc>
+        <w:tc>
+          <w:tcPr>
+            <w:tcW w:w="1337" w:type="dxa"/>
+            <w:tcMar>
+              <w:top w:w="100" w:type="dxa"/>
+              <w:left w:w="120" w:type="dxa"/>
+              <w:bottom w:w="100" w:type="dxa"/>
+              <w:right w:w="120" w:type="dxa"/>
+            </w:tcMar>
+            <w:vAlign w:val="center"/>
+          </w:tcPr>
+          <w:p>
+            <w:pPr>
+              <w:spacing w:line="240" w:lineRule="auto"/>
+              <w:ind w:firstLine="0"/>
+              <w:jc w:val="left"/>
+            </w:pPr>
+            <w:r>
+              <w:rPr>
+                <w:rFonts w:cs="Times New Roman"/>
+                <w:sz w:val="22"/>
+              </w:rPr>
+              <w:t>5</w:t>
+            </w:r>
+          </w:p>
+        </w:tc>
+        <w:tc>
+          <w:tcPr>
+            <w:tcW w:w="1337" w:type="dxa"/>
+            <w:tcMar>
+              <w:top w:w="100" w:type="dxa"/>
+              <w:left w:w="120" w:type="dxa"/>
+              <w:bottom w:w="100" w:type="dxa"/>
+              <w:right w:w="120" w:type="dxa"/>
+            </w:tcMar>
+            <w:vAlign w:val="center"/>
+          </w:tcPr>
+          <w:p>
+            <w:pPr>
+              <w:spacing w:line="240" w:lineRule="auto"/>
+              <w:ind w:firstLine="0"/>
+              <w:jc w:val="left"/>
+            </w:pPr>
+            <w:r>
+              <w:rPr>
+                <w:rFonts w:cs="Times New Roman"/>
+                <w:sz w:val="22"/>
+              </w:rPr>
+              <w:t>4</w:t>
+            </w:r>
+          </w:p>
+        </w:tc>
+        <w:tc>
+          <w:tcPr>
+            <w:tcW w:w="1335" w:type="dxa"/>
+            <w:tcMar>
+              <w:top w:w="100" w:type="dxa"/>
+              <w:left w:w="120" w:type="dxa"/>
+              <w:bottom w:w="100" w:type="dxa"/>
+              <w:right w:w="120" w:type="dxa"/>
+            </w:tcMar>
+            <w:vAlign w:val="center"/>
+          </w:tcPr>
+          <w:p>
+            <w:pPr>
+              <w:spacing w:line="240" w:lineRule="auto"/>
+              <w:ind w:firstLine="0"/>
+              <w:jc w:val="left"/>
+            </w:pPr>
+            <w:r>
+              <w:rPr>
+                <w:rFonts w:cs="Times New Roman"/>
+                <w:sz w:val="22"/>
+              </w:rPr>
+              <w:t>5</w:t>
+            </w:r>
+          </w:p>
+        </w:tc>
+      </w:tr>
+      <w:tr>
+        <w:trPr>
+          <w:cantSplit/>
+        </w:trPr>
+        <w:tc>
+          <w:tcPr>
+            <w:tcW w:w="4344" w:type="dxa"/>
+            <w:tcMar>
+              <w:top w:w="100" w:type="dxa"/>
+              <w:left w:w="120" w:type="dxa"/>
+              <w:bottom w:w="100" w:type="dxa"/>
+              <w:right w:w="120" w:type="dxa"/>
+            </w:tcMar>
+            <w:vAlign w:val="center"/>
+          </w:tcPr>
+          <w:p>
+            <w:pPr>
+              <w:spacing w:line="240" w:lineRule="auto"/>
+              <w:ind w:firstLine="0"/>
+              <w:jc w:val="left"/>
+            </w:pPr>
+            <w:r>
+              <w:rPr>
+                <w:rFonts w:cs="Times New Roman"/>
+                <w:sz w:val="22"/>
+              </w:rPr>
+              <w:t xml:space="preserve">Интеграционное </w:t>
+            </w:r>
+            <w:r>
+              <w:rPr>
+                <w:rFonts w:cs="Times New Roman"/>
+                <w:sz w:val="22"/>
+              </w:rPr>
+              <w:t>тестирование</w:t>
+            </w:r>
+          </w:p>
+        </w:tc>
+        <w:tc>
+          <w:tcPr>
+            <w:tcW w:w="1337" w:type="dxa"/>
+            <w:tcMar>
+              <w:top w:w="100" w:type="dxa"/>
+              <w:left w:w="120" w:type="dxa"/>
+              <w:bottom w:w="100" w:type="dxa"/>
+              <w:right w:w="120" w:type="dxa"/>
+            </w:tcMar>
+            <w:vAlign w:val="center"/>
+          </w:tcPr>
+          <w:p>
+            <w:pPr>
+              <w:spacing w:line="240" w:lineRule="auto"/>
+              <w:ind w:firstLine="0"/>
+              <w:jc w:val="left"/>
+            </w:pPr>
+            <w:r>
+              <w:rPr>
+                <w:rFonts w:cs="Times New Roman"/>
+                <w:sz w:val="22"/>
+              </w:rPr>
+              <w:t>10</w:t>
+            </w:r>
+          </w:p>
+        </w:tc>
+        <w:tc>
+          <w:tcPr>
+            <w:tcW w:w="1337" w:type="dxa"/>
+            <w:tcMar>
+              <w:top w:w="100" w:type="dxa"/>
+              <w:left w:w="120" w:type="dxa"/>
+              <w:bottom w:w="100" w:type="dxa"/>
+              <w:right w:w="120" w:type="dxa"/>
+            </w:tcMar>
+            <w:vAlign w:val="center"/>
+          </w:tcPr>
+          <w:p>
+            <w:pPr>
+              <w:spacing w:line="240" w:lineRule="auto"/>
+              <w:ind w:firstLine="0"/>
+              <w:jc w:val="left"/>
+            </w:pPr>
+            <w:r>
+              <w:rPr>
+                <w:rFonts w:cs="Times New Roman"/>
+                <w:sz w:val="22"/>
+              </w:rPr>
+              <w:t>5</w:t>
+            </w:r>
+          </w:p>
+        </w:tc>
+        <w:tc>
+          <w:tcPr>
+            <w:tcW w:w="1337" w:type="dxa"/>
+            <w:tcMar>
+              <w:top w:w="100" w:type="dxa"/>
+              <w:left w:w="120" w:type="dxa"/>
+              <w:bottom w:w="100" w:type="dxa"/>
+              <w:right w:w="120" w:type="dxa"/>
+            </w:tcMar>
+            <w:vAlign w:val="center"/>
+          </w:tcPr>
+          <w:p>
+            <w:pPr>
+              <w:spacing w:line="240" w:lineRule="auto"/>
+              <w:ind w:firstLine="0"/>
+              <w:jc w:val="left"/>
+            </w:pPr>
+            <w:r>
+              <w:rPr>
+                <w:rFonts w:cs="Times New Roman"/>
+                <w:sz w:val="22"/>
+              </w:rPr>
+              <w:t>4</w:t>
+            </w:r>
+          </w:p>
+        </w:tc>
+        <w:tc>
+          <w:tcPr>
+            <w:tcW w:w="1335" w:type="dxa"/>
+            <w:tcMar>
+              <w:top w:w="100" w:type="dxa"/>
+              <w:left w:w="120" w:type="dxa"/>
+              <w:bottom w:w="100" w:type="dxa"/>
+              <w:right w:w="120" w:type="dxa"/>
+            </w:tcMar>
+            <w:vAlign w:val="center"/>
+          </w:tcPr>
+          <w:p>
+            <w:pPr>
+              <w:spacing w:line="240" w:lineRule="auto"/>
+              <w:ind w:firstLine="0"/>
+              <w:jc w:val="left"/>
+            </w:pPr>
+            <w:r>
+              <w:rPr>
+                <w:rFonts w:cs="Times New Roman"/>
+                <w:sz w:val="22"/>
+              </w:rPr>
+              <w:t>5</w:t>
+            </w:r>
+          </w:p>
+        </w:tc>
+      </w:tr>
+      <w:tr>
+        <w:trPr>
+          <w:cantSplit/>
+        </w:trPr>
+        <w:tc>
+          <w:tcPr>
+            <w:tcW w:w="4344" w:type="dxa"/>
+            <w:tcMar>
+              <w:top w:w="100" w:type="dxa"/>
+              <w:left w:w="120" w:type="dxa"/>
+              <w:bottom w:w="100" w:type="dxa"/>
+              <w:right w:w="120" w:type="dxa"/>
+            </w:tcMar>
+            <w:vAlign w:val="center"/>
+          </w:tcPr>
+          <w:p>
+            <w:pPr>
+              <w:spacing w:line="240" w:lineRule="auto"/>
+              <w:ind w:firstLine="0"/>
+              <w:jc w:val="left"/>
+            </w:pPr>
+            <w:r>
+              <w:rPr>
+                <w:rFonts w:cs="Times New Roman"/>
+                <w:sz w:val="22"/>
+              </w:rPr>
+              <w:t>Простота воспроизводимой сборки</w:t>
+            </w:r>
+          </w:p>
+        </w:tc>
+        <w:tc>
+          <w:tcPr>
+            <w:tcW w:w="1337" w:type="dxa"/>
+            <w:tcMar>
+              <w:top w:w="100" w:type="dxa"/>
+              <w:left w:w="120" w:type="dxa"/>
+              <w:bottom w:w="100" w:type="dxa"/>
+              <w:right w:w="120" w:type="dxa"/>
+            </w:tcMar>
+            <w:vAlign w:val="center"/>
+          </w:tcPr>
+          <w:p>
+            <w:pPr>
+              <w:spacing w:line="240" w:lineRule="auto"/>
+              <w:ind w:firstLine="0"/>
+              <w:jc w:val="left"/>
+            </w:pPr>
+            <w:r>
+              <w:rPr>
+                <w:rFonts w:cs="Times New Roman"/>
+                <w:sz w:val="22"/>
+              </w:rPr>
+              <w:t>10</w:t>
+            </w:r>
+          </w:p>
+        </w:tc>
+        <w:tc>
+          <w:tcPr>
+            <w:tcW w:w="1337" w:type="dxa"/>
+            <w:tcMar>
+              <w:top w:w="100" w:type="dxa"/>
+              <w:left w:w="120" w:type="dxa"/>
+              <w:bottom w:w="100" w:type="dxa"/>
+              <w:right w:w="120" w:type="dxa"/>
+            </w:tcMar>
+            <w:vAlign w:val="center"/>
+          </w:tcPr>
+          <w:p>
+            <w:pPr>
+              <w:spacing w:line="240" w:lineRule="auto"/>
+              <w:ind w:firstLine="0"/>
+              <w:jc w:val="left"/>
+            </w:pPr>
+            <w:r>
+              <w:rPr>
+                <w:rFonts w:cs="Times New Roman"/>
+                <w:sz w:val="22"/>
+              </w:rPr>
+              <w:t>4</w:t>
+            </w:r>
+          </w:p>
+        </w:tc>
+        <w:tc>
+          <w:tcPr>
+            <w:tcW w:w="1337" w:type="dxa"/>
+            <w:tcMar>
+              <w:top w:w="100" w:type="dxa"/>
+              <w:left w:w="120" w:type="dxa"/>
+              <w:bottom w:w="100" w:type="dxa"/>
+              <w:right w:w="120" w:type="dxa"/>
+            </w:tcMar>
+            <w:vAlign w:val="center"/>
+          </w:tcPr>
+          <w:p>
+            <w:pPr>
+              <w:spacing w:line="240" w:lineRule="auto"/>
+              <w:ind w:firstLine="0"/>
+              <w:jc w:val="left"/>
+            </w:pPr>
+            <w:r>
+              <w:rPr>
+                <w:rFonts w:cs="Times New Roman"/>
+                <w:sz w:val="22"/>
+              </w:rPr>
+              <w:t>4</w:t>
+            </w:r>
+          </w:p>
+        </w:tc>
+        <w:tc>
+          <w:tcPr>
+            <w:tcW w:w="1335" w:type="dxa"/>
+            <w:tcMar>
+              <w:top w:w="100" w:type="dxa"/>
+              <w:left w:w="120" w:type="dxa"/>
+              <w:bottom w:w="100" w:type="dxa"/>
+              <w:right w:w="120" w:type="dxa"/>
+            </w:tcMar>
+            <w:vAlign w:val="center"/>
+          </w:tcPr>
+          <w:p>
+            <w:pPr>
+              <w:spacing w:line="240" w:lineRule="auto"/>
+              <w:ind w:firstLine="0"/>
+              <w:jc w:val="left"/>
+            </w:pPr>
+            <w:r>
+              <w:rPr>
+                <w:rFonts w:cs="Times New Roman"/>
+                <w:sz w:val="22"/>
+              </w:rPr>
+              <w:t>4</w:t>
+            </w:r>
+          </w:p>
+        </w:tc>
+      </w:tr>
+      <w:tr>
+        <w:trPr>
+          <w:cantSplit/>
+        </w:trPr>
+        <w:tc>
+          <w:tcPr>
+            <w:tcW w:w="4344" w:type="dxa"/>
+            <w:tcMar>
+              <w:top w:w="100" w:type="dxa"/>
+              <w:left w:w="120" w:type="dxa"/>
+              <w:bottom w:w="100" w:type="dxa"/>
+              <w:right w:w="120" w:type="dxa"/>
+            </w:tcMar>
+            <w:vAlign w:val="center"/>
+          </w:tcPr>
+          <w:p>
+            <w:pPr>
+              <w:spacing w:line="240" w:lineRule="auto"/>
+              <w:ind w:firstLine="0"/>
+              <w:jc w:val="left"/>
+            </w:pPr>
+            <w:r>
+              <w:rPr>
+                <w:rFonts w:cs="Times New Roman"/>
+                <w:sz w:val="22"/>
+              </w:rPr>
+              <w:t>Взвешенный итог</w:t>
+            </w:r>
+          </w:p>
+        </w:tc>
+        <w:tc>
+          <w:tcPr>
+            <w:tcW w:w="1337" w:type="dxa"/>
+            <w:tcMar>
+              <w:top w:w="100" w:type="dxa"/>
+              <w:left w:w="120" w:type="dxa"/>
+              <w:bottom w:w="100" w:type="dxa"/>
+              <w:right w:w="120" w:type="dxa"/>
+            </w:tcMar>
+            <w:vAlign w:val="center"/>
+          </w:tcPr>
+          <w:p>
+            <w:pPr>
+              <w:spacing w:line="240" w:lineRule="auto"/>
+              <w:ind w:firstLine="0"/>
+              <w:jc w:val="left"/>
+            </w:pPr>
+            <w:r>
+              <w:rPr>
+                <w:rFonts w:cs="Times New Roman"/>
+                <w:sz w:val="22"/>
+              </w:rPr>
+              <w:t>100</w:t>
+            </w:r>
+          </w:p>
+        </w:tc>
+        <w:tc>
+          <w:tcPr>
+            <w:tcW w:w="1337" w:type="dxa"/>
+            <w:tcMar>
+              <w:top w:w="100" w:type="dxa"/>
+              <w:left w:w="120" w:type="dxa"/>
+              <w:bottom w:w="100" w:type="dxa"/>
+              <w:right w:w="120" w:type="dxa"/>
+            </w:tcMar>
+            <w:vAlign w:val="center"/>
+          </w:tcPr>
+          <w:p>
+            <w:pPr>
+              <w:spacing w:line="240" w:lineRule="auto"/>
+              <w:ind w:firstLine="0"/>
+              <w:jc w:val="left"/>
+            </w:pPr>
+            <w:r>
+              <w:rPr>
+                <w:rFonts w:cs="Times New Roman"/>
+                <w:sz w:val="22"/>
+              </w:rPr>
+              <w:t>4,90</w:t>
+            </w:r>
+          </w:p>
+        </w:tc>
+        <w:tc>
+          <w:tcPr>
+            <w:tcW w:w="1337" w:type="dxa"/>
+            <w:tcMar>
+              <w:top w:w="100" w:type="dxa"/>
+              <w:left w:w="120" w:type="dxa"/>
+              <w:bottom w:w="100" w:type="dxa"/>
+              <w:right w:w="120" w:type="dxa"/>
+            </w:tcMar>
+            <w:vAlign w:val="center"/>
+          </w:tcPr>
+          <w:p>
+            <w:pPr>
+              <w:spacing w:line="240" w:lineRule="auto"/>
+              <w:ind w:firstLine="0"/>
+              <w:jc w:val="left"/>
+            </w:pPr>
+            <w:r>
+              <w:rPr>
+                <w:rFonts w:cs="Times New Roman"/>
+                <w:sz w:val="22"/>
+              </w:rPr>
+              <w:t>3,15</w:t>
+            </w:r>
+          </w:p>
+        </w:tc>
+        <w:tc>
+          <w:tcPr>
+            <w:tcW w:w="1335" w:type="dxa"/>
+            <w:tcMar>
+              <w:top w:w="100" w:type="dxa"/>
+              <w:left w:w="120" w:type="dxa"/>
+              <w:bottom w:w="100" w:type="dxa"/>
+              <w:right w:w="120" w:type="dxa"/>
+            </w:tcMar>
+            <w:vAlign w:val="center"/>
+          </w:tcPr>
+          <w:p>
+            <w:pPr>
+              <w:spacing w:line="240" w:lineRule="auto"/>
+              <w:ind w:firstLine="0"/>
+              <w:jc w:val="left"/>
+            </w:pPr>
+            <w:r>
+              <w:rPr>
+                <w:rFonts w:cs="Times New Roman"/>
+                <w:sz w:val="22"/>
+              </w:rPr>
+              <w:t>4,10</w:t>
+            </w:r>
+          </w:p>
+        </w:tc>
+      </w:tr>
+    </w:tbl>
+    <w:p/>
+    <w:p>
+      <w:r>
+        <w:rPr>
+          <w:rFonts w:cs="Times New Roman"/>
+        </w:rPr>
+        <w:t xml:space="preserve">NestJS привлекателен единым языком TypeScript на frontend и backend, модульной архитектурой, guards и удобным быстрым стартом. Он хорошо подходит для </w:t>
+      </w:r>
+      <w:r>
+        <w:rPr>
+          <w:rFonts w:cs="Times New Roman"/>
+        </w:rPr>
+        <w:t>I/O-нагруженных API и позволяет выбирать Express либо Fastify. Однако для требуемой session-аутентификации необходимо согласовать несколько отдельных механизмов и middleware, а итоговая поставка зависит от Node.js и не соответствует формату JAR. Для данного проекта преимущество общего языка не компенсирует менее прямое выполнение требований безопасности и упаковки.</w:t>
       </w:r>
     </w:p>
     <w:p>
@@ -8746,13 +9875,34 @@
         <w:rPr>
           <w:rFonts w:cs="Times New Roman"/>
         </w:rPr>
-        <w:t>Spring Boot выбран по совокупности проектных факторов. В исходном репозитории уже находились Java-модель пользователя и основа авторизации, поэтому их развитие безопаснее полного переноса. Spring Security предоставляет единый фильтровый конвейер для session-аутентификации, CSRF и разграничения ролей; Spring Data JPA согласуется с реляционной моделью каталога; Spring Boot Maven Plugin формирует исполняемый JAR. Переход на NestJS или ASP.NET Core потребовал бы повторной реализации и повторной проверки наиболе</w:t>
+        <w:t xml:space="preserve">ASP.NET Core является наиболее близким конкурентом Spring Boot. Он предлагает строгую типизацию C#, встроенный dependency injection, развитую модель middleware, средства авторизации, тестирования и высокопроизводительный сервер Kestrel. При выборе экосистемы .NET это было бы полноценное production-решение. Его итоговая оценка ниже только из-за целевого формата поставки: приложение должно собираться средствами </w:t>
       </w:r>
       <w:r>
         <w:rPr>
           <w:rFonts w:cs="Times New Roman"/>
         </w:rPr>
-        <w:t>е критичного участка — безопасности — без изменения функций для пользователя.</w:t>
+        <w:lastRenderedPageBreak/>
+        <w:t>Maven и запускаться как Java JAR. Переход к .NET изменил бы модель сборки и формат артефакта, не добавляя необходимых предметных функций.</w:t>
+      </w:r>
+    </w:p>
+    <w:p>
+      <w:r>
+        <w:rPr>
+          <w:rFonts w:cs="Times New Roman"/>
+        </w:rPr>
+        <w:t xml:space="preserve">Spring Boot получил наибольшую оценку как наиболее цельное решение для заданных условий. Spring </w:t>
+      </w:r>
+      <w:r>
+        <w:rPr>
+          <w:rFonts w:cs="Times New Roman"/>
+        </w:rPr>
+        <w:t>Security объединяет session-аутентификацию, CSRF, разграничение ролей и обработку отказов в одном фильтровом конвейере. Spring MVC и Bean Validation обеспечивают типизированные входные контракты и единообразную проверку запросов. Spring Data JPA и декларативные транзакции согласуются с нормализованной моделью каталога, optimistic locking и PostgreSQL. Spring Boot Test, JUnit и MockMvc позволяют проверять API вместе с контекстом безопасности и базой данных. Наконец, Maven фиксирует версии зависимостей, а Spr</w:t>
+      </w:r>
+      <w:r>
+        <w:rPr>
+          <w:rFonts w:cs="Times New Roman"/>
+        </w:rPr>
+        <w:t>ing Boot Maven Plugin создаёт единый исполняемый JAR с сервером и frontend-ресурсами. Таким образом, Spring Boot выбран по совокупности преимуществ в безопасности, целостности данных, тестируемости и простоте поставки.</w:t>
       </w:r>
     </w:p>
     <w:p>
@@ -8814,7 +9964,7 @@
       <w:pPr>
         <w:pStyle w:val="21"/>
       </w:pPr>
-      <w:bookmarkStart w:id="16" w:name="_Toc234800632"/>
+      <w:bookmarkStart w:id="16" w:name="_Toc234829225"/>
       <w:r>
         <w:rPr>
           <w:rFonts w:ascii="Times New Roman" w:eastAsia="Times New Roman" w:hAnsi="Times New Roman" w:cs="Times New Roman"/>
@@ -8857,7 +10007,7 @@
         <w:pStyle w:val="1"/>
         <w:pageBreakBefore/>
       </w:pPr>
-      <w:bookmarkStart w:id="17" w:name="_Toc234800633"/>
+      <w:bookmarkStart w:id="17" w:name="_Toc234829226"/>
       <w:r>
         <w:rPr>
           <w:rFonts w:ascii="Times New Roman" w:eastAsia="Times New Roman" w:hAnsi="Times New Roman" w:cs="Times New Roman"/>
@@ -8871,7 +10021,7 @@
       <w:pPr>
         <w:pStyle w:val="21"/>
       </w:pPr>
-      <w:bookmarkStart w:id="18" w:name="_Toc234800634"/>
+      <w:bookmarkStart w:id="18" w:name="_Toc234829227"/>
       <w:r>
         <w:rPr>
           <w:rFonts w:ascii="Times New Roman" w:eastAsia="Times New Roman" w:hAnsi="Times New Roman" w:cs="Times New Roman"/>
@@ -8912,7 +10062,7 @@
           <w:noProof/>
         </w:rPr>
         <w:drawing>
-          <wp:inline distT="0" distB="0" distL="0" distR="0" wp14:anchorId="14DF5DA2" wp14:editId="5817DA41">
+          <wp:inline distT="0" distB="0" distL="0" distR="0" wp14:anchorId="0A3B3B73" wp14:editId="1D64654C">
             <wp:extent cx="5806440" cy="3869875"/>
             <wp:effectExtent l="0" t="0" r="0" b="0"/>
             <wp:docPr id="3" name="Picture 3" descr="Рисунок 2 – Концептуальная и даталогическая модель"/>
@@ -8971,7 +10121,7 @@
       <w:pPr>
         <w:pStyle w:val="21"/>
       </w:pPr>
-      <w:bookmarkStart w:id="19" w:name="_Toc234800635"/>
+      <w:bookmarkStart w:id="19" w:name="_Toc234829228"/>
       <w:r>
         <w:rPr>
           <w:rFonts w:ascii="Times New Roman" w:eastAsia="Times New Roman" w:hAnsi="Times New Roman" w:cs="Times New Roman"/>
@@ -9328,7 +10478,14 @@
                 <w:rFonts w:cs="Times New Roman"/>
                 <w:sz w:val="22"/>
               </w:rPr>
-              <w:t>slug, family, model, granularity, status, площадь, расход, мощность, температура, давление, габариты, масса, version</w:t>
+              <w:t xml:space="preserve">slug, family, model, </w:t>
+            </w:r>
+            <w:r>
+              <w:rPr>
+                <w:rFonts w:cs="Times New Roman"/>
+                <w:sz w:val="22"/>
+              </w:rPr>
+              <w:t>granularity, status, площадь, расход, мощность, температура, давление, габариты, масса, version</w:t>
             </w:r>
           </w:p>
         </w:tc>
@@ -9743,14 +10900,7 @@
                 <w:rFonts w:cs="Times New Roman"/>
                 <w:sz w:val="22"/>
               </w:rPr>
-              <w:t xml:space="preserve">fact_key, label, value, unit, </w:t>
-            </w:r>
-            <w:r>
-              <w:rPr>
-                <w:rFonts w:cs="Times New Roman"/>
-                <w:sz w:val="22"/>
-              </w:rPr>
-              <w:t>sort_order</w:t>
+              <w:t>fact_key, label, value, unit, sort_order</w:t>
             </w:r>
           </w:p>
         </w:tc>
@@ -9833,7 +10983,14 @@
                 <w:rFonts w:cs="Times New Roman"/>
                 <w:sz w:val="22"/>
               </w:rPr>
-              <w:t>title, url, checked_on, measurement_basis</w:t>
+              <w:t xml:space="preserve">title, url, </w:t>
+            </w:r>
+            <w:r>
+              <w:rPr>
+                <w:rFonts w:cs="Times New Roman"/>
+                <w:sz w:val="22"/>
+              </w:rPr>
+              <w:t>checked_on, measurement_basis</w:t>
             </w:r>
           </w:p>
         </w:tc>
@@ -9927,7 +11084,7 @@
       <w:pPr>
         <w:pStyle w:val="21"/>
       </w:pPr>
-      <w:bookmarkStart w:id="20" w:name="_Toc234800636"/>
+      <w:bookmarkStart w:id="20" w:name="_Toc234829229"/>
       <w:r>
         <w:rPr>
           <w:rFonts w:ascii="Times New Roman" w:eastAsia="Times New Roman" w:hAnsi="Times New Roman" w:cs="Times New Roman"/>
@@ -10022,7 +11179,7 @@
         <w:pStyle w:val="1"/>
         <w:pageBreakBefore/>
       </w:pPr>
-      <w:bookmarkStart w:id="21" w:name="_Toc234800637"/>
+      <w:bookmarkStart w:id="21" w:name="_Toc234829230"/>
       <w:r>
         <w:rPr>
           <w:rFonts w:ascii="Times New Roman" w:eastAsia="Times New Roman" w:hAnsi="Times New Roman" w:cs="Times New Roman"/>
@@ -10036,7 +11193,7 @@
       <w:pPr>
         <w:pStyle w:val="21"/>
       </w:pPr>
-      <w:bookmarkStart w:id="22" w:name="_Toc234800638"/>
+      <w:bookmarkStart w:id="22" w:name="_Toc234829231"/>
       <w:r>
         <w:rPr>
           <w:rFonts w:ascii="Times New Roman" w:eastAsia="Times New Roman" w:hAnsi="Times New Roman" w:cs="Times New Roman"/>
@@ -10056,7 +11213,7 @@
           <w:noProof/>
         </w:rPr>
         <w:drawing>
-          <wp:inline distT="0" distB="0" distL="0" distR="0" wp14:anchorId="261CD79E" wp14:editId="3B88805F">
+          <wp:inline distT="0" distB="0" distL="0" distR="0" wp14:anchorId="2F8EE921" wp14:editId="18926CA2">
             <wp:extent cx="5806440" cy="1489762"/>
             <wp:effectExtent l="0" t="0" r="0" b="0"/>
             <wp:docPr id="4" name="Picture 4" descr="Рисунок 3 – Компоненты приложения"/>
@@ -10128,7 +11285,7 @@
       <w:pPr>
         <w:pStyle w:val="21"/>
       </w:pPr>
-      <w:bookmarkStart w:id="23" w:name="_Toc234800639"/>
+      <w:bookmarkStart w:id="23" w:name="_Toc234829232"/>
       <w:r>
         <w:rPr>
           <w:rFonts w:ascii="Times New Roman" w:eastAsia="Times New Roman" w:hAnsi="Times New Roman" w:cs="Times New Roman"/>
@@ -10261,7 +11418,7 @@
       <w:pPr>
         <w:pStyle w:val="21"/>
       </w:pPr>
-      <w:bookmarkStart w:id="24" w:name="_Toc234800640"/>
+      <w:bookmarkStart w:id="24" w:name="_Toc234829233"/>
       <w:r>
         <w:rPr>
           <w:rFonts w:ascii="Times New Roman" w:eastAsia="Times New Roman" w:hAnsi="Times New Roman" w:cs="Times New Roman"/>
@@ -10310,7 +11467,7 @@
       <w:pPr>
         <w:pStyle w:val="21"/>
       </w:pPr>
-      <w:bookmarkStart w:id="25" w:name="_Toc234800641"/>
+      <w:bookmarkStart w:id="25" w:name="_Toc234829234"/>
       <w:r>
         <w:rPr>
           <w:rFonts w:ascii="Times New Roman" w:eastAsia="Times New Roman" w:hAnsi="Times New Roman" w:cs="Times New Roman"/>
@@ -10378,7 +11535,7 @@
       <w:pPr>
         <w:pStyle w:val="21"/>
       </w:pPr>
-      <w:bookmarkStart w:id="26" w:name="_Toc234800642"/>
+      <w:bookmarkStart w:id="26" w:name="_Toc234829235"/>
       <w:r>
         <w:rPr>
           <w:rFonts w:ascii="Times New Roman" w:eastAsia="Times New Roman" w:hAnsi="Times New Roman" w:cs="Times New Roman"/>
@@ -10746,7 +11903,7 @@
         <w:pStyle w:val="1"/>
         <w:pageBreakBefore/>
       </w:pPr>
-      <w:bookmarkStart w:id="27" w:name="_Toc234800643"/>
+      <w:bookmarkStart w:id="27" w:name="_Toc234829236"/>
       <w:r>
         <w:rPr>
           <w:rFonts w:ascii="Times New Roman" w:eastAsia="Times New Roman" w:hAnsi="Times New Roman" w:cs="Times New Roman"/>
@@ -10760,7 +11917,7 @@
       <w:pPr>
         <w:pStyle w:val="21"/>
       </w:pPr>
-      <w:bookmarkStart w:id="28" w:name="_Toc234800644"/>
+      <w:bookmarkStart w:id="28" w:name="_Toc234829237"/>
       <w:r>
         <w:rPr>
           <w:rFonts w:ascii="Times New Roman" w:eastAsia="Times New Roman" w:hAnsi="Times New Roman" w:cs="Times New Roman"/>
@@ -10786,7 +11943,7 @@
           <w:noProof/>
         </w:rPr>
         <w:drawing>
-          <wp:inline distT="0" distB="0" distL="0" distR="0" wp14:anchorId="7EB18A49" wp14:editId="7C13012F">
+          <wp:inline distT="0" distB="0" distL="0" distR="0" wp14:anchorId="445E4DEE" wp14:editId="70E07D72">
             <wp:extent cx="5806440" cy="1074061"/>
             <wp:effectExtent l="0" t="0" r="0" b="0"/>
             <wp:docPr id="5" name="Picture 5" descr="Рисунок 4 – Блок-схема поиска и ранжирования"/>
@@ -10845,7 +12002,7 @@
       <w:pPr>
         <w:pStyle w:val="21"/>
       </w:pPr>
-      <w:bookmarkStart w:id="29" w:name="_Toc234800645"/>
+      <w:bookmarkStart w:id="29" w:name="_Toc234829238"/>
       <w:r>
         <w:rPr>
           <w:rFonts w:ascii="Times New Roman" w:eastAsia="Times New Roman" w:hAnsi="Times New Roman" w:cs="Times New Roman"/>
@@ -10937,7 +12094,7 @@
       <w:pPr>
         <w:pStyle w:val="21"/>
       </w:pPr>
-      <w:bookmarkStart w:id="30" w:name="_Toc234800646"/>
+      <w:bookmarkStart w:id="30" w:name="_Toc234829239"/>
       <w:r>
         <w:rPr>
           <w:rFonts w:ascii="Times New Roman" w:eastAsia="Times New Roman" w:hAnsi="Times New Roman" w:cs="Times New Roman"/>
@@ -10973,7 +12130,7 @@
         <w:pStyle w:val="1"/>
         <w:pageBreakBefore/>
       </w:pPr>
-      <w:bookmarkStart w:id="31" w:name="_Toc234800647"/>
+      <w:bookmarkStart w:id="31" w:name="_Toc234829240"/>
       <w:r>
         <w:rPr>
           <w:rFonts w:ascii="Times New Roman" w:eastAsia="Times New Roman" w:hAnsi="Times New Roman" w:cs="Times New Roman"/>
@@ -10987,7 +12144,7 @@
       <w:pPr>
         <w:pStyle w:val="21"/>
       </w:pPr>
-      <w:bookmarkStart w:id="32" w:name="_Toc234800648"/>
+      <w:bookmarkStart w:id="32" w:name="_Toc234829241"/>
       <w:r>
         <w:rPr>
           <w:rFonts w:ascii="Times New Roman" w:eastAsia="Times New Roman" w:hAnsi="Times New Roman" w:cs="Times New Roman"/>
@@ -11389,7 +12546,7 @@
       <w:pPr>
         <w:pStyle w:val="21"/>
       </w:pPr>
-      <w:bookmarkStart w:id="33" w:name="_Toc234800649"/>
+      <w:bookmarkStart w:id="33" w:name="_Toc234829242"/>
       <w:r>
         <w:rPr>
           <w:rFonts w:ascii="Times New Roman" w:eastAsia="Times New Roman" w:hAnsi="Times New Roman" w:cs="Times New Roman"/>
@@ -11423,7 +12580,7 @@
       <w:pPr>
         <w:pStyle w:val="21"/>
       </w:pPr>
-      <w:bookmarkStart w:id="34" w:name="_Toc234800650"/>
+      <w:bookmarkStart w:id="34" w:name="_Toc234829243"/>
       <w:r>
         <w:rPr>
           <w:rFonts w:ascii="Times New Roman" w:eastAsia="Times New Roman" w:hAnsi="Times New Roman" w:cs="Times New Roman"/>
@@ -11484,7 +12641,7 @@
         <w:pStyle w:val="1"/>
         <w:pageBreakBefore/>
       </w:pPr>
-      <w:bookmarkStart w:id="35" w:name="_Toc234800651"/>
+      <w:bookmarkStart w:id="35" w:name="_Toc234829244"/>
       <w:r>
         <w:rPr>
           <w:rFonts w:ascii="Times New Roman" w:eastAsia="Times New Roman" w:hAnsi="Times New Roman" w:cs="Times New Roman"/>
@@ -11498,7 +12655,7 @@
       <w:pPr>
         <w:pStyle w:val="21"/>
       </w:pPr>
-      <w:bookmarkStart w:id="36" w:name="_Toc234800652"/>
+      <w:bookmarkStart w:id="36" w:name="_Toc234829245"/>
       <w:r>
         <w:rPr>
           <w:rFonts w:ascii="Times New Roman" w:eastAsia="Times New Roman" w:hAnsi="Times New Roman" w:cs="Times New Roman"/>
@@ -11579,7 +12736,7 @@
       <w:pPr>
         <w:pStyle w:val="21"/>
       </w:pPr>
-      <w:bookmarkStart w:id="37" w:name="_Toc234800653"/>
+      <w:bookmarkStart w:id="37" w:name="_Toc234829246"/>
       <w:r>
         <w:rPr>
           <w:rFonts w:ascii="Times New Roman" w:eastAsia="Times New Roman" w:hAnsi="Times New Roman" w:cs="Times New Roman"/>
@@ -11635,7 +12792,7 @@
       <w:pPr>
         <w:pStyle w:val="21"/>
       </w:pPr>
-      <w:bookmarkStart w:id="38" w:name="_Toc234800654"/>
+      <w:bookmarkStart w:id="38" w:name="_Toc234829247"/>
       <w:r>
         <w:rPr>
           <w:rFonts w:ascii="Times New Roman" w:eastAsia="Times New Roman" w:hAnsi="Times New Roman" w:cs="Times New Roman"/>
@@ -11678,7 +12835,7 @@
         <w:pStyle w:val="1"/>
         <w:pageBreakBefore/>
       </w:pPr>
-      <w:bookmarkStart w:id="39" w:name="_Toc234800655"/>
+      <w:bookmarkStart w:id="39" w:name="_Toc234829248"/>
       <w:r>
         <w:rPr>
           <w:rFonts w:ascii="Times New Roman" w:eastAsia="Times New Roman" w:hAnsi="Times New Roman" w:cs="Times New Roman"/>
@@ -11717,7 +12874,7 @@
         <w:pStyle w:val="1"/>
         <w:pageBreakBefore/>
       </w:pPr>
-      <w:bookmarkStart w:id="40" w:name="_Toc234800656"/>
+      <w:bookmarkStart w:id="40" w:name="_Toc234829249"/>
       <w:r>
         <w:rPr>
           <w:rFonts w:ascii="Times New Roman" w:eastAsia="Times New Roman" w:hAnsi="Times New Roman" w:cs="Times New Roman"/>
@@ -11975,7 +13132,7 @@
         <w:pStyle w:val="1"/>
         <w:pageBreakBefore/>
       </w:pPr>
-      <w:bookmarkStart w:id="41" w:name="_Toc234800657"/>
+      <w:bookmarkStart w:id="41" w:name="_Toc234829250"/>
       <w:r>
         <w:rPr>
           <w:rFonts w:ascii="Times New Roman" w:eastAsia="Times New Roman" w:hAnsi="Times New Roman" w:cs="Times New Roman"/>
@@ -12479,7 +13636,14 @@
                 <w:rFonts w:cs="Times New Roman"/>
                 <w:sz w:val="22"/>
               </w:rPr>
-              <w:t>GET /api/heat-exchangers/{slug}</w:t>
+              <w:t xml:space="preserve">GET </w:t>
+            </w:r>
+            <w:r>
+              <w:rPr>
+                <w:rFonts w:cs="Times New Roman"/>
+                <w:sz w:val="22"/>
+              </w:rPr>
+              <w:t>/api/heat-exchangers/{slug}</w:t>
             </w:r>
           </w:p>
         </w:tc>
@@ -12837,7 +14001,14 @@
                 <w:rFonts w:cs="Times New Roman"/>
                 <w:sz w:val="22"/>
               </w:rPr>
-              <w:t>роли, блокировка, удаление</w:t>
+              <w:t xml:space="preserve">роли, </w:t>
+            </w:r>
+            <w:r>
+              <w:rPr>
+                <w:rFonts w:cs="Times New Roman"/>
+                <w:sz w:val="22"/>
+              </w:rPr>
+              <w:t>блокировка, удаление</w:t>
             </w:r>
           </w:p>
         </w:tc>
@@ -12854,7 +14025,7 @@
         <w:pStyle w:val="1"/>
         <w:pageBreakBefore/>
       </w:pPr>
-      <w:bookmarkStart w:id="42" w:name="_Toc234800658"/>
+      <w:bookmarkStart w:id="42" w:name="_Toc234829251"/>
       <w:r>
         <w:rPr>
           <w:rFonts w:ascii="Times New Roman" w:eastAsia="Times New Roman" w:hAnsi="Times New Roman" w:cs="Times New Roman"/>
@@ -13268,7 +14439,14 @@
                 <w:rFonts w:cs="Times New Roman"/>
                 <w:sz w:val="22"/>
               </w:rPr>
-              <w:t>POST без CSRF</w:t>
+              <w:t xml:space="preserve">POST </w:t>
+            </w:r>
+            <w:r>
+              <w:rPr>
+                <w:rFonts w:cs="Times New Roman"/>
+                <w:sz w:val="22"/>
+              </w:rPr>
+              <w:t>без CSRF</w:t>
             </w:r>
           </w:p>
         </w:tc>
@@ -13294,14 +14472,7 @@
                 <w:rFonts w:cs="Times New Roman"/>
                 <w:sz w:val="22"/>
               </w:rPr>
-              <w:t xml:space="preserve">403 </w:t>
-            </w:r>
-            <w:r>
-              <w:rPr>
-                <w:rFonts w:cs="Times New Roman"/>
-                <w:sz w:val="22"/>
-              </w:rPr>
-              <w:t>CSRF_MISSING</w:t>
+              <w:t>403 CSRF_MISSING</w:t>
             </w:r>
           </w:p>
         </w:tc>
@@ -13633,14 +14804,14 @@
                 <w:rFonts w:cs="Times New Roman"/>
                 <w:sz w:val="22"/>
               </w:rPr>
-              <w:t xml:space="preserve">все общие поля </w:t>
-            </w:r>
-            <w:r>
-              <w:rPr>
-                <w:rFonts w:cs="Times New Roman"/>
-                <w:sz w:val="22"/>
-              </w:rPr>
-              <w:t>заполнены</w:t>
+              <w:t xml:space="preserve">все </w:t>
+            </w:r>
+            <w:r>
+              <w:rPr>
+                <w:rFonts w:cs="Times New Roman"/>
+                <w:sz w:val="22"/>
+              </w:rPr>
+              <w:t>общие поля заполнены</w:t>
             </w:r>
           </w:p>
         </w:tc>
@@ -13972,14 +15143,14 @@
                 <w:rFonts w:cs="Times New Roman"/>
                 <w:sz w:val="22"/>
               </w:rPr>
-              <w:t xml:space="preserve">статус ARCHIVED, </w:t>
-            </w:r>
-            <w:r>
-              <w:rPr>
-                <w:rFonts w:cs="Times New Roman"/>
-                <w:sz w:val="22"/>
-              </w:rPr>
-              <w:t>физическая запись сохранена</w:t>
+              <w:t xml:space="preserve">статус </w:t>
+            </w:r>
+            <w:r>
+              <w:rPr>
+                <w:rFonts w:cs="Times New Roman"/>
+                <w:sz w:val="22"/>
+              </w:rPr>
+              <w:t>ARCHIVED, физическая запись сохранена</w:t>
             </w:r>
           </w:p>
         </w:tc>
@@ -14162,7 +15333,7 @@
         <w:pStyle w:val="1"/>
         <w:pageBreakBefore/>
       </w:pPr>
-      <w:bookmarkStart w:id="43" w:name="_Toc234800659"/>
+      <w:bookmarkStart w:id="43" w:name="_Toc234829252"/>
       <w:r>
         <w:rPr>
           <w:rFonts w:ascii="Times New Roman" w:eastAsia="Times New Roman" w:hAnsi="Times New Roman" w:cs="Times New Roman"/>
@@ -14557,31 +15728,31 @@
       </w:rPr>
     </w:lvl>
   </w:abstractNum>
-  <w:num w:numId="1" w16cid:durableId="1212575647">
+  <w:num w:numId="1" w16cid:durableId="1907296952">
     <w:abstractNumId w:val="8"/>
   </w:num>
-  <w:num w:numId="2" w16cid:durableId="1089542209">
+  <w:num w:numId="2" w16cid:durableId="946160463">
     <w:abstractNumId w:val="6"/>
   </w:num>
-  <w:num w:numId="3" w16cid:durableId="627471457">
+  <w:num w:numId="3" w16cid:durableId="1109547829">
     <w:abstractNumId w:val="5"/>
   </w:num>
-  <w:num w:numId="4" w16cid:durableId="1544945923">
+  <w:num w:numId="4" w16cid:durableId="39402327">
     <w:abstractNumId w:val="4"/>
   </w:num>
-  <w:num w:numId="5" w16cid:durableId="443882947">
+  <w:num w:numId="5" w16cid:durableId="510486125">
     <w:abstractNumId w:val="7"/>
   </w:num>
-  <w:num w:numId="6" w16cid:durableId="1063986683">
+  <w:num w:numId="6" w16cid:durableId="1004628317">
     <w:abstractNumId w:val="3"/>
   </w:num>
-  <w:num w:numId="7" w16cid:durableId="1200897679">
+  <w:num w:numId="7" w16cid:durableId="1583296340">
     <w:abstractNumId w:val="2"/>
   </w:num>
-  <w:num w:numId="8" w16cid:durableId="409809095">
+  <w:num w:numId="8" w16cid:durableId="1181158992">
     <w:abstractNumId w:val="1"/>
   </w:num>
-  <w:num w:numId="9" w16cid:durableId="405569191">
+  <w:num w:numId="9" w16cid:durableId="544027646">
     <w:abstractNumId w:val="0"/>
   </w:num>
 </w:numbering>
@@ -25989,7 +27160,7 @@
     <w:autoRedefine/>
     <w:uiPriority w:val="39"/>
     <w:unhideWhenUsed/>
-    <w:rsid w:val="00D90496"/>
+    <w:rsid w:val="00A8540C"/>
     <w:pPr>
       <w:spacing w:after="100"/>
     </w:pPr>
@@ -26001,7 +27172,7 @@
     <w:autoRedefine/>
     <w:uiPriority w:val="39"/>
     <w:unhideWhenUsed/>
-    <w:rsid w:val="00D90496"/>
+    <w:rsid w:val="00A8540C"/>
     <w:pPr>
       <w:spacing w:after="100"/>
       <w:ind w:left="280"/>
@@ -26012,7 +27183,7 @@
     <w:basedOn w:val="a2"/>
     <w:uiPriority w:val="99"/>
     <w:unhideWhenUsed/>
-    <w:rsid w:val="00D90496"/>
+    <w:rsid w:val="00A8540C"/>
     <w:rPr>
       <w:color w:val="0000FF" w:themeColor="hyperlink"/>
       <w:u w:val="single"/>

</xml_diff>